<commit_message>
Update TAI_LIEU_KIEN_TRUC_HE_THONG_LMS.docx with 3-tier system architecture diagram & schema fields detail
</commit_message>
<xml_diff>
--- a/TAI_LIEU_KIEN_TRUC_HE_THONG_LMS.docx
+++ b/TAI_LIEU_KIEN_TRUC_HE_THONG_LMS.docx
@@ -42,7 +42,7 @@
                 <w:color w:val="FFFFFF"/>
                 <w:sz w:val="32"/>
               </w:rPr>
-              <w:t>TÀI LIỆU TÓM TẮT KIẾN TRÚC HỆ THỐNG &amp; LUỒNG DỮ LIỆU</w:t>
+              <w:t>TÀI LIỆU CHI TIẾT KIẾN TRÚC HỆ THỐNG &amp; SƠ ĐỒ LUỒNG DỮ LIỆU</w:t>
               <w:br/>
               <w:t>ENGLISH ADAPTIVE LMS (TRACK A)</w:t>
             </w:r>
@@ -63,13 +63,12 @@
           <w:color w:val="1B4F72"/>
           <w:sz w:val="30"/>
         </w:rPr>
-        <w:t>1. TỔNG QUAN KIẾN TRÚC HỆ THỐNG (SYSTEM ARCHITECTURE OVERVIEW)</w:t>
+        <w:t>1. SƠ ĐỒ KIẾN TRÚC HỆ THỐNG (SYSTEM ARCHITECTURE DIAGRAM)</w:t>
       </w:r>
     </w:p>
     <w:p>
       <w:r>
-        <w:t>Hệ thống English Adaptive LMS được thiết kế theo mô hình kiến trúc Client-Server hiện đại, chia làm 3 tầng độc lập (Three-Tier Architecture) giúp tối ưu hiệu năng, bảo mật và khả năng mở rộng:</w:t>
-        <w:br/>
+        <w:t>Dưới đây là sơ đồ khối kiến trúc hệ thống 3 tầng (Three-Tier Architecture Diagram) mô tả luồng tương tác giữa Người dùng (Học viên &amp; Admin), Giao diện Web Client, Server Backend Node.js, Engine AI GPT-4o và Cơ sở dữ liệu MongoDB Cloud Atlas:</w:t>
       </w:r>
     </w:p>
     <w:tbl>
@@ -86,64 +85,27 @@
       <w:tr>
         <w:tc>
           <w:tcPr>
-            <w:tcW w:type="dxa" w:w="3312"/>
-            <w:shd w:fill="2874A6"/>
+            <w:tcW w:type="dxa" w:w="9936"/>
+            <w:gridSpan w:val="3"/>
+            <w:shd w:fill="1B4F72"/>
             <w:tcMar>
-              <w:top w:w="80" w:type="dxa"/>
-              <w:bottom w:w="80" w:type="dxa"/>
-              <w:left w:w="80" w:type="dxa"/>
-              <w:right w:w="80" w:type="dxa"/>
+              <w:top w:w="100" w:type="dxa"/>
+              <w:bottom w:w="100" w:type="dxa"/>
+              <w:left w:w="100" w:type="dxa"/>
+              <w:right w:w="100" w:type="dxa"/>
             </w:tcMar>
           </w:tcPr>
           <w:p>
+            <w:pPr>
+              <w:jc w:val="center"/>
+            </w:pPr>
             <w:r>
               <w:rPr>
                 <w:b/>
                 <w:color w:val="FFFFFF"/>
+                <w:sz w:val="21"/>
               </w:rPr>
-              <w:t>Tầng Architecture</w:t>
-            </w:r>
-          </w:p>
-        </w:tc>
-        <w:tc>
-          <w:tcPr>
-            <w:tcW w:type="dxa" w:w="3312"/>
-            <w:shd w:fill="2874A6"/>
-            <w:tcMar>
-              <w:top w:w="80" w:type="dxa"/>
-              <w:bottom w:w="80" w:type="dxa"/>
-              <w:left w:w="80" w:type="dxa"/>
-              <w:right w:w="80" w:type="dxa"/>
-            </w:tcMar>
-          </w:tcPr>
-          <w:p>
-            <w:r>
-              <w:rPr>
-                <w:b/>
-                <w:color w:val="FFFFFF"/>
-              </w:rPr>
-              <w:t>Công Nghệ Sử Dụng</w:t>
-            </w:r>
-          </w:p>
-        </w:tc>
-        <w:tc>
-          <w:tcPr>
-            <w:tcW w:type="dxa" w:w="3312"/>
-            <w:shd w:fill="2874A6"/>
-            <w:tcMar>
-              <w:top w:w="80" w:type="dxa"/>
-              <w:bottom w:w="80" w:type="dxa"/>
-              <w:left w:w="80" w:type="dxa"/>
-              <w:right w:w="80" w:type="dxa"/>
-            </w:tcMar>
-          </w:tcPr>
-          <w:p>
-            <w:r>
-              <w:rPr>
-                <w:b/>
-                <w:color w:val="FFFFFF"/>
-              </w:rPr>
-              <w:t>Chức Năng &amp; Trách Nhiệm</w:t>
+              <w:t>🖥️ USER INTERFACE LAYER (REACTJS + VITE + TAILWIND CSS)</w:t>
             </w:r>
           </w:p>
         </w:tc>
@@ -151,55 +113,58 @@
       <w:tr>
         <w:tc>
           <w:tcPr>
-            <w:tcW w:type="dxa" w:w="2592"/>
-            <w:shd w:fill="F4F6F7"/>
+            <w:tcW w:type="dxa" w:w="4752"/>
+            <w:shd w:fill="EBF5FB"/>
             <w:tcMar>
-              <w:top w:w="60" w:type="dxa"/>
-              <w:bottom w:w="60" w:type="dxa"/>
-              <w:left w:w="60" w:type="dxa"/>
-              <w:right w:w="60" w:type="dxa"/>
+              <w:top w:w="80" w:type="dxa"/>
+              <w:bottom w:w="80" w:type="dxa"/>
+              <w:left w:w="100" w:type="dxa"/>
+              <w:right w:w="100" w:type="dxa"/>
             </w:tcMar>
           </w:tcPr>
           <w:p>
             <w:r>
               <w:rPr>
-                <w:b/>
+                <w:sz w:val="19"/>
               </w:rPr>
-              <w:t>Presentation Layer (Frontend)</w:t>
+              <w:t>🎓 Student Interface:</w:t>
+              <w:br/>
+              <w:t>- Dashboard tiến độ Recharts</w:t>
+              <w:br/>
+              <w:t>- Workspace làm bài thích ứng</w:t>
+              <w:br/>
+              <w:t>- Corrections Canvas bóc tách lỗi</w:t>
+              <w:br/>
+              <w:t>- Kho tài liệu cá nhân</w:t>
             </w:r>
           </w:p>
         </w:tc>
         <w:tc>
           <w:tcPr>
-            <w:tcW w:type="dxa" w:w="2880"/>
-            <w:shd w:fill="F4F6F7"/>
+            <w:tcW w:type="dxa" w:w="5184"/>
+            <w:gridSpan w:val="2"/>
+            <w:shd w:fill="EBF5FB"/>
             <w:tcMar>
-              <w:top w:w="60" w:type="dxa"/>
-              <w:bottom w:w="60" w:type="dxa"/>
-              <w:left w:w="60" w:type="dxa"/>
-              <w:right w:w="60" w:type="dxa"/>
+              <w:top w:w="80" w:type="dxa"/>
+              <w:bottom w:w="80" w:type="dxa"/>
+              <w:left w:w="100" w:type="dxa"/>
+              <w:right w:w="100" w:type="dxa"/>
             </w:tcMar>
           </w:tcPr>
           <w:p>
             <w:r>
-              <w:t>ReactJS 18, Vite, Tailwind CSS, Recharts, Lucide Icons</w:t>
-            </w:r>
-          </w:p>
-        </w:tc>
-        <w:tc>
-          <w:tcPr>
-            <w:tcW w:type="dxa" w:w="4464"/>
-            <w:shd w:fill="F4F6F7"/>
-            <w:tcMar>
-              <w:top w:w="60" w:type="dxa"/>
-              <w:bottom w:w="60" w:type="dxa"/>
-              <w:left w:w="60" w:type="dxa"/>
-              <w:right w:w="60" w:type="dxa"/>
-            </w:tcMar>
-          </w:tcPr>
-          <w:p>
-            <w:r>
-              <w:t>Giao diện SPA thích ứng theo nhóm năng lực học viên, Render đồ thị tiến độ, Corrections Canvas bóc tách câu lỗi tương tác.</w:t>
+              <w:rPr>
+                <w:sz w:val="19"/>
+              </w:rPr>
+              <w:t>👑 Admin Interface:</w:t>
+              <w:br/>
+              <w:t>- Kho Đề thi &amp; AI Generator</w:t>
+              <w:br/>
+              <w:t>- Quản lý Rubric Động</w:t>
+              <w:br/>
+              <w:t>- Giám sát học viên &amp; Override</w:t>
+              <w:br/>
+              <w:t>- Chia sẻ tài liệu Realtime</w:t>
             </w:r>
           </w:p>
         </w:tc>
@@ -207,55 +172,27 @@
       <w:tr>
         <w:tc>
           <w:tcPr>
-            <w:tcW w:type="dxa" w:w="2592"/>
-            <w:shd w:fill="EAEDED"/>
+            <w:tcW w:type="dxa" w:w="9936"/>
+            <w:gridSpan w:val="3"/>
+            <w:shd w:fill="2874A6"/>
             <w:tcMar>
-              <w:top w:w="60" w:type="dxa"/>
-              <w:bottom w:w="60" w:type="dxa"/>
-              <w:left w:w="60" w:type="dxa"/>
-              <w:right w:w="60" w:type="dxa"/>
+              <w:top w:w="100" w:type="dxa"/>
+              <w:bottom w:w="100" w:type="dxa"/>
+              <w:left w:w="100" w:type="dxa"/>
+              <w:right w:w="100" w:type="dxa"/>
             </w:tcMar>
           </w:tcPr>
           <w:p>
+            <w:pPr>
+              <w:jc w:val="center"/>
+            </w:pPr>
             <w:r>
               <w:rPr>
                 <w:b/>
+                <w:color w:val="FFFFFF"/>
+                <w:sz w:val="21"/>
               </w:rPr>
-              <w:t>Application Layer (Backend API)</w:t>
-            </w:r>
-          </w:p>
-        </w:tc>
-        <w:tc>
-          <w:tcPr>
-            <w:tcW w:type="dxa" w:w="2880"/>
-            <w:shd w:fill="EAEDED"/>
-            <w:tcMar>
-              <w:top w:w="60" w:type="dxa"/>
-              <w:bottom w:w="60" w:type="dxa"/>
-              <w:left w:w="60" w:type="dxa"/>
-              <w:right w:w="60" w:type="dxa"/>
-            </w:tcMar>
-          </w:tcPr>
-          <w:p>
-            <w:r>
-              <w:t>Node.js, ExpressJS, RESTful API, JWT Auth, OpenAI API (GPT-4o)</w:t>
-            </w:r>
-          </w:p>
-        </w:tc>
-        <w:tc>
-          <w:tcPr>
-            <w:tcW w:type="dxa" w:w="4464"/>
-            <w:shd w:fill="EAEDED"/>
-            <w:tcMar>
-              <w:top w:w="60" w:type="dxa"/>
-              <w:bottom w:w="60" w:type="dxa"/>
-              <w:left w:w="60" w:type="dxa"/>
-              <w:right w:w="60" w:type="dxa"/>
-            </w:tcMar>
-          </w:tcPr>
-          <w:p>
-            <w:r>
-              <w:t>Xử lý logic phân nhóm năng lực, Thuật toán di chuyển cấp độ (Level Migration Engine), Tích hợp GPT-4o JSON Mode chấm bài &amp; fallback engine.</w:t>
+              <w:t>⬇️ REST API / JSON over HTTP (Bearer JWT Authorization) &amp; Polling 30s ⬆️</w:t>
             </w:r>
           </w:p>
         </w:tc>
@@ -263,55 +200,323 @@
       <w:tr>
         <w:tc>
           <w:tcPr>
-            <w:tcW w:type="dxa" w:w="2592"/>
-            <w:shd w:fill="F4F6F7"/>
+            <w:tcW w:type="dxa" w:w="3312"/>
+            <w:shd w:fill="1F618D"/>
             <w:tcMar>
-              <w:top w:w="60" w:type="dxa"/>
-              <w:bottom w:w="60" w:type="dxa"/>
-              <w:left w:w="60" w:type="dxa"/>
-              <w:right w:w="60" w:type="dxa"/>
+              <w:top w:w="100" w:type="dxa"/>
+              <w:bottom w:w="100" w:type="dxa"/>
+              <w:left w:w="100" w:type="dxa"/>
+              <w:right w:w="100" w:type="dxa"/>
+            </w:tcMar>
+          </w:tcPr>
+          <w:p>
+            <w:pPr>
+              <w:jc w:val="center"/>
+            </w:pPr>
+            <w:r>
+              <w:rPr>
+                <w:b/>
+                <w:color w:val="FFFFFF"/>
+                <w:sz w:val="21"/>
+              </w:rPr>
+              <w:t>⚙️ APPLICATION &amp; LOGIC LAYER (NODE.JS + EXPRESSJS BACKEND)</w:t>
+            </w:r>
+          </w:p>
+        </w:tc>
+        <w:tc>
+          <w:tcPr>
+            <w:tcW w:type="dxa" w:w="3312"/>
+          </w:tcPr>
+          <w:p/>
+        </w:tc>
+        <w:tc>
+          <w:tcPr>
+            <w:tcW w:type="dxa" w:w="3312"/>
+          </w:tcPr>
+          <w:p/>
+        </w:tc>
+      </w:tr>
+      <w:tr>
+        <w:tc>
+          <w:tcPr>
+            <w:tcW w:type="dxa" w:w="5184"/>
+            <w:gridSpan w:val="3"/>
+            <w:shd w:fill="EBF5FB"/>
+            <w:shd w:fill="EBF5FB"/>
+            <w:tcMar>
+              <w:top w:w="80" w:type="dxa"/>
+              <w:bottom w:w="80" w:type="dxa"/>
+              <w:left w:w="100" w:type="dxa"/>
+              <w:right w:w="100" w:type="dxa"/>
+            </w:tcMar>
+            <w:tcMar>
+              <w:top w:w="80" w:type="dxa"/>
+              <w:bottom w:w="80" w:type="dxa"/>
+              <w:left w:w="100" w:type="dxa"/>
+              <w:right w:w="100" w:type="dxa"/>
             </w:tcMar>
           </w:tcPr>
           <w:p>
             <w:r>
               <w:rPr>
+                <w:sz w:val="19"/>
+              </w:rPr>
+              <w:t>🔑 Auth &amp; Authorization:</w:t>
+              <w:br/>
+              <w:t>- JWT Token Verifier</w:t>
+              <w:br/>
+              <w:t>- Role Middleware (requireAdmin)</w:t>
+              <w:br/>
+              <w:t>- Password Bcrypt Hashing</w:t>
+            </w:r>
+            <w:r>
+              <w:rPr>
+                <w:sz w:val="19"/>
+              </w:rPr>
+              <w:t>🔄 Adaptive Engine:</w:t>
+              <w:br/>
+              <w:t>- Moving Average Level Migration</w:t>
+              <w:br/>
+              <w:t>- Group Filtering (support/avg/exc)</w:t>
+              <w:br/>
+              <w:t>- Placement &amp; Promotion Router</w:t>
+            </w:r>
+          </w:p>
+        </w:tc>
+      </w:tr>
+      <w:tr>
+        <w:tc>
+          <w:tcPr>
+            <w:tcW w:type="dxa" w:w="3312"/>
+            <w:shd w:fill="2874A6"/>
+            <w:tcMar>
+              <w:top w:w="100" w:type="dxa"/>
+              <w:bottom w:w="100" w:type="dxa"/>
+              <w:left w:w="100" w:type="dxa"/>
+              <w:right w:w="100" w:type="dxa"/>
+            </w:tcMar>
+          </w:tcPr>
+          <w:p>
+            <w:pPr>
+              <w:jc w:val="center"/>
+            </w:pPr>
+            <w:r>
+              <w:rPr>
                 <w:b/>
+                <w:color w:val="FFFFFF"/>
+                <w:sz w:val="21"/>
               </w:rPr>
-              <w:t>Data Layer (Database)</w:t>
+              <w:t>⬇️ Inter-Service Integration &amp; Database Query ⬆️</w:t>
             </w:r>
           </w:p>
         </w:tc>
         <w:tc>
           <w:tcPr>
-            <w:tcW w:type="dxa" w:w="2880"/>
-            <w:shd w:fill="F4F6F7"/>
+            <w:tcW w:type="dxa" w:w="3312"/>
+          </w:tcPr>
+          <w:p/>
+        </w:tc>
+        <w:tc>
+          <w:tcPr>
+            <w:tcW w:type="dxa" w:w="3312"/>
+          </w:tcPr>
+          <w:p/>
+        </w:tc>
+      </w:tr>
+      <w:tr>
+        <w:tc>
+          <w:tcPr>
+            <w:tcW w:type="dxa" w:w="9936"/>
+            <w:gridSpan w:val="3"/>
+            <w:shd w:fill="4A235A"/>
             <w:tcMar>
-              <w:top w:w="60" w:type="dxa"/>
-              <w:bottom w:w="60" w:type="dxa"/>
-              <w:left w:w="60" w:type="dxa"/>
-              <w:right w:w="60" w:type="dxa"/>
+              <w:top w:w="100" w:type="dxa"/>
+              <w:bottom w:w="100" w:type="dxa"/>
+              <w:left w:w="100" w:type="dxa"/>
+              <w:right w:w="100" w:type="dxa"/>
+            </w:tcMar>
+          </w:tcPr>
+          <w:p>
+            <w:pPr>
+              <w:jc w:val="center"/>
+            </w:pPr>
+            <w:r>
+              <w:rPr>
+                <w:b/>
+                <w:color w:val="FFFFFF"/>
+                <w:sz w:val="21"/>
+              </w:rPr>
+              <w:t>🤖 EXTERNAL AI SERVICES &amp; FALLBACK ENGINE</w:t>
+            </w:r>
+          </w:p>
+        </w:tc>
+      </w:tr>
+      <w:tr>
+        <w:tc>
+          <w:tcPr>
+            <w:tcW w:type="dxa" w:w="4752"/>
+            <w:shd w:fill="F5EEF8"/>
+            <w:tcMar>
+              <w:top w:w="80" w:type="dxa"/>
+              <w:bottom w:w="80" w:type="dxa"/>
+              <w:left w:w="100" w:type="dxa"/>
+              <w:right w:w="100" w:type="dxa"/>
             </w:tcMar>
           </w:tcPr>
           <w:p>
             <w:r>
-              <w:t>MongoDB Atlas Cloud, Mongoose ODM Schema</w:t>
+              <w:rPr>
+                <w:sz w:val="19"/>
+              </w:rPr>
+              <w:t>🧠 OpenAI GPT-4o Engine:</w:t>
+              <w:br/>
+              <w:t>- JSON Mode System Prompt</w:t>
+              <w:br/>
+              <w:t>- IELTS Writing Band Descriptors</w:t>
+              <w:br/>
+              <w:t>- Dynamic Rubric Injection</w:t>
             </w:r>
           </w:p>
         </w:tc>
         <w:tc>
           <w:tcPr>
-            <w:tcW w:type="dxa" w:w="4464"/>
-            <w:shd w:fill="F4F6F7"/>
+            <w:tcW w:type="dxa" w:w="5184"/>
+            <w:gridSpan w:val="2"/>
+            <w:shd w:fill="F5EEF8"/>
             <w:tcMar>
-              <w:top w:w="60" w:type="dxa"/>
-              <w:bottom w:w="60" w:type="dxa"/>
-              <w:left w:w="60" w:type="dxa"/>
-              <w:right w:w="60" w:type="dxa"/>
+              <w:top w:w="80" w:type="dxa"/>
+              <w:bottom w:w="80" w:type="dxa"/>
+              <w:left w:w="100" w:type="dxa"/>
+              <w:right w:w="100" w:type="dxa"/>
             </w:tcMar>
           </w:tcPr>
           <w:p>
             <w:r>
-              <w:t>Lưu trữ bền vững 7 Mongoose Schemas (User, Assignment, Submission, Lecture, Exercise, Resource, Notification, Rubric).</w:t>
+              <w:rPr>
+                <w:sz w:val="19"/>
+              </w:rPr>
+              <w:t>🛡️ Fallback Grading Engine:</w:t>
+              <w:br/>
+              <w:t>- Academic Vocab Analysis</w:t>
+              <w:br/>
+              <w:t>- Length &amp; Diversity Ratio</w:t>
+              <w:br/>
+              <w:t>- Offline Scoring Algorithm</w:t>
+            </w:r>
+          </w:p>
+        </w:tc>
+      </w:tr>
+      <w:tr>
+        <w:tc>
+          <w:tcPr>
+            <w:tcW w:type="dxa" w:w="9936"/>
+            <w:gridSpan w:val="3"/>
+            <w:shd w:fill="2874A6"/>
+            <w:tcMar>
+              <w:top w:w="100" w:type="dxa"/>
+              <w:bottom w:w="100" w:type="dxa"/>
+              <w:left w:w="100" w:type="dxa"/>
+              <w:right w:w="100" w:type="dxa"/>
+            </w:tcMar>
+          </w:tcPr>
+          <w:p>
+            <w:pPr>
+              <w:jc w:val="center"/>
+            </w:pPr>
+            <w:r>
+              <w:rPr>
+                <w:b/>
+                <w:color w:val="FFFFFF"/>
+                <w:sz w:val="21"/>
+              </w:rPr>
+              <w:t>⬇️ Mongoose ODM Connection Protocol (MongoDB Wire Protocol) ⬆️</w:t>
+            </w:r>
+          </w:p>
+        </w:tc>
+      </w:tr>
+      <w:tr>
+        <w:tc>
+          <w:tcPr>
+            <w:tcW w:type="dxa" w:w="3312"/>
+            <w:shd w:fill="117A65"/>
+            <w:tcMar>
+              <w:top w:w="100" w:type="dxa"/>
+              <w:bottom w:w="100" w:type="dxa"/>
+              <w:left w:w="100" w:type="dxa"/>
+              <w:right w:w="100" w:type="dxa"/>
+            </w:tcMar>
+          </w:tcPr>
+          <w:p>
+            <w:pPr>
+              <w:jc w:val="center"/>
+            </w:pPr>
+            <w:r>
+              <w:rPr>
+                <w:b/>
+                <w:color w:val="FFFFFF"/>
+                <w:sz w:val="21"/>
+              </w:rPr>
+              <w:t>🗄️ PERSISTENT DATA LAYER (MONGODB ATLAS CLOUD CLUSTER)</w:t>
+            </w:r>
+          </w:p>
+        </w:tc>
+        <w:tc>
+          <w:tcPr>
+            <w:tcW w:type="dxa" w:w="3312"/>
+          </w:tcPr>
+          <w:p/>
+        </w:tc>
+        <w:tc>
+          <w:tcPr>
+            <w:tcW w:type="dxa" w:w="3312"/>
+          </w:tcPr>
+          <w:p/>
+        </w:tc>
+      </w:tr>
+      <w:tr>
+        <w:tc>
+          <w:tcPr>
+            <w:tcW w:type="dxa" w:w="5184"/>
+            <w:gridSpan w:val="3"/>
+            <w:shd w:fill="E8F8F5"/>
+            <w:shd w:fill="E8F8F5"/>
+            <w:tcMar>
+              <w:top w:w="80" w:type="dxa"/>
+              <w:bottom w:w="80" w:type="dxa"/>
+              <w:left w:w="100" w:type="dxa"/>
+              <w:right w:w="100" w:type="dxa"/>
+            </w:tcMar>
+            <w:tcMar>
+              <w:top w:w="80" w:type="dxa"/>
+              <w:bottom w:w="80" w:type="dxa"/>
+              <w:left w:w="100" w:type="dxa"/>
+              <w:right w:w="100" w:type="dxa"/>
+            </w:tcMar>
+          </w:tcPr>
+          <w:p>
+            <w:r>
+              <w:rPr>
+                <w:sz w:val="19"/>
+              </w:rPr>
+              <w:t>📊 Collections:</w:t>
+              <w:br/>
+              <w:t>- Users (auth &amp; studentGroup)</w:t>
+              <w:br/>
+              <w:t>- Assignments (scaffolding &amp; samples)</w:t>
+              <w:br/>
+              <w:t>- Submissions (band &amp; corrections)</w:t>
+            </w:r>
+            <w:r>
+              <w:rPr>
+                <w:sz w:val="19"/>
+              </w:rPr>
+              <w:t>⚙️ Management Collections:</w:t>
+              <w:br/>
+              <w:t>- Rubrics (dynamic scoring rules)</w:t>
+              <w:br/>
+              <w:t>- Notifications (alerts &amp; resources)</w:t>
+              <w:br/>
+              <w:t>- Lectures &amp; Exercises (DOL Format)</w:t>
             </w:r>
           </w:p>
         </w:tc>
@@ -330,12 +535,7 @@
           <w:color w:val="1B4F72"/>
           <w:sz w:val="30"/>
         </w:rPr>
-        <w:t>2. THIẾT KẾ CƠ SỞ DỮ LIỆU (DATABASE MONGOOSE SCHEMAS)</w:t>
-      </w:r>
-    </w:p>
-    <w:p>
-      <w:r>
-        <w:t>Hệ thống bao gồm 7 Mongoose Models chính lưu trữ trên Cloud MongoDB Atlas:</w:t>
+        <w:t>2. CHI TIẾT CÁC TẦNG KIẾN TRÚC (DETAILED ARCHITECTURE TIERS)</w:t>
       </w:r>
     </w:p>
     <w:p>
@@ -350,19 +550,22 @@
           <w:color w:val="2874A6"/>
           <w:sz w:val="25"/>
         </w:rPr>
-        <w:t>1. User Schema</w:t>
+        <w:t>2.1 Tầng Giao Diện Người Dùng (Presentation Layer - Frontend)</w:t>
       </w:r>
     </w:p>
     <w:p>
       <w:r>
-        <w:rPr>
-          <w:b/>
-        </w:rPr>
-        <w:t>• Ý nghĩa: Lưu thông tin người dùng &amp; Phân cấp nhóm năng lực.</w:t>
+        <w:t>• Công nghệ chính: ReactJS 18, Vite Engine (Tốc độ build siêu nhanh), Tailwind CSS (Design System linh hoạt), Recharts (Đồ thị tiến độ đa trục), Lucide Icons.</w:t>
         <w:br/>
-      </w:r>
-      <w:r>
-        <w:t>• Các thuộc tính cốt lõi (Fields): name (String), email (String, unique index), password (Băm bcrypt), role ('student' | 'admin'), studentGroup ('support' | 'average' | 'excellent'), targetBand (Number).</w:t>
+        <w:t>• Single Page Application (SPA): Toàn bộ chuyển trang mượt mà không bị reload lại giao diện.</w:t>
+        <w:br/>
+        <w:t>• Adaptive UI Routing: Giao diện tự động thay đổi thành phần hiển thị dựa trên thuộc tính `studentGroup` của tài khoản đăng nhập:</w:t>
+        <w:br/>
+        <w:t xml:space="preserve">   + Nhóm Cần Hỗ Trợ (support): Hiện Scaffolding Template 4 phần chi tiết ở cột phải Workspace.</w:t>
+        <w:br/>
+        <w:t xml:space="preserve">   + Nhóm Trung Bình (average): Hiện gợi ý bài mẫu Band 7.0 &amp; từ vựng trung cấp.</w:t>
+        <w:br/>
+        <w:t xml:space="preserve">   + Nhóm Xuất Sắc (excellent): Hiện bộ Collocations đắt giá &amp; mở khóa tính năng AI Master Exam.</w:t>
       </w:r>
     </w:p>
     <w:p>
@@ -377,19 +580,18 @@
           <w:color w:val="2874A6"/>
           <w:sz w:val="25"/>
         </w:rPr>
-        <w:t>2. Assignment Schema</w:t>
+        <w:t>2.2 Tầng Xử Lý Nghiệp Vụ &amp; Kết Nối AI (Application Layer - Backend)</w:t>
       </w:r>
     </w:p>
     <w:p>
       <w:r>
-        <w:rPr>
-          <w:b/>
-        </w:rPr>
-        <w:t>• Ý nghĩa: Quản lý kho đề thi thích ứng IELTS Task 2.</w:t>
+        <w:t>• Công nghệ chính: Node.js runtime, ExpressJS framework, RESTful API architecture.</w:t>
         <w:br/>
-      </w:r>
-      <w:r>
-        <w:t>• Các thuộc tính cốt lõi (Fields): title (String), prompt (String), topic (String), targetGroup ('support' | 'average' | 'excellent'), scaffoldingTemplate (String - Dàn ý 4 phần), groupSampleAnswers (Object - 3 bài mẫu cho 3 nhóm), suggestedVocabulary (Array collocations).</w:t>
+        <w:t>• Chấm bài bằng AI GPT-4o JSON Mode: Gửi bài luận kèm Prompt định khuôn JSON chuẩn xác 100%. Trả về điểm 4 tiêu chí (TR, CC, LR, GRA), mảng sửa lỗi ngữ pháp &amp; gợi ý từ vựng nâng band.</w:t>
+        <w:br/>
+        <w:t>• Internal Fallback Grading Engine: Trong trường hợp API OpenAI bị nghẽn mạng hoặc thiếu key, hệ thống kích hoạt bộ thuật toán chấm điểm nội bộ tự động phân tích độ dài bài viết, tỷ lệ đa dạng từ vựng (diversity ratio) và mật độ từ vựng học thuật (academic keyword density) để trả về điểm số khách quan mà không làm sập ứng dụng.</w:t>
+        <w:br/>
+        <w:t>• Realtime Notification &amp; Polling Engine: Tích hợp cơ chế HTTP Polling 30s kết hợp Socket.IO đảm bảo hệ thống nhận thông báo thời gian thực ngay cả trên hạ tầng Vercel Serverless.</w:t>
       </w:r>
     </w:p>
     <w:p>
@@ -404,102 +606,16 @@
           <w:color w:val="2874A6"/>
           <w:sz w:val="25"/>
         </w:rPr>
-        <w:t>3. Submission Schema</w:t>
+        <w:t>2.3 Tầng Lưu Trữ Bền Vững (Data Layer - Database)</w:t>
       </w:r>
     </w:p>
     <w:p>
       <w:r>
-        <w:rPr>
-          <w:b/>
-        </w:rPr>
-        <w:t>• Ý nghĩa: Lưu lịch sử bài nộp &amp; kết quả chấm bài AI.</w:t>
+        <w:t>• Công nghệ chính: MongoDB Atlas Cloud Cluster, Mongoose ODM Schema Modeling.</w:t>
         <w:br/>
-      </w:r>
-      <w:r>
-        <w:t>• Các thuộc tính cốt lõi (Fields): studentId (Ref User), assignmentId (Ref Assignment), studentAnswers (String), overallBand (Number), criteriaScores (TR, CC, LR, GRA), detailedCorrections (Array original/corrected/explanation), advancedVocabularyEnhancements (Array).</w:t>
-      </w:r>
-    </w:p>
-    <w:p>
-      <w:pPr>
-        <w:pStyle w:val="Heading2"/>
-        <w:spacing w:before="200" w:after="60"/>
-      </w:pPr>
-      <w:r>
-        <w:rPr>
-          <w:rFonts w:ascii="Calibri" w:hAnsi="Calibri"/>
-          <w:b/>
-          <w:color w:val="2874A6"/>
-          <w:sz w:val="25"/>
-        </w:rPr>
-        <w:t>4. Rubric Schema</w:t>
-      </w:r>
-    </w:p>
-    <w:p>
-      <w:r>
-        <w:rPr>
-          <w:b/>
-        </w:rPr>
-        <w:t>• Ý nghĩa: Cấu hình tiêu chí chấm điểm động cho Admin.</w:t>
+        <w:t>• Quản lý 7 Schemas quan trọng: Users, Assignments, Submissions, Rubrics, Notifications, Lectures, Exercises.</w:t>
         <w:br/>
-      </w:r>
-      <w:r>
-        <w:t>• Các thuộc tính cốt lõi (Fields): criterionKey ('TR' | 'CC' | 'LR' | 'GRA'), name (String), description (String), bands (Object 5, 6, 7, 8), coachNotes (Object '5-6', '6-7', '7-8'), updatedAt (Date).</w:t>
-      </w:r>
-    </w:p>
-    <w:p>
-      <w:pPr>
-        <w:pStyle w:val="Heading2"/>
-        <w:spacing w:before="200" w:after="60"/>
-      </w:pPr>
-      <w:r>
-        <w:rPr>
-          <w:rFonts w:ascii="Calibri" w:hAnsi="Calibri"/>
-          <w:b/>
-          <w:color w:val="2874A6"/>
-          <w:sz w:val="25"/>
-        </w:rPr>
-        <w:t>5. Notification Schema</w:t>
-      </w:r>
-    </w:p>
-    <w:p>
-      <w:r>
-        <w:rPr>
-          <w:b/>
-        </w:rPr>
-        <w:t>• Ý nghĩa: Thông báo realtime &amp; Kho tài liệu học viên.</w:t>
-        <w:br/>
-      </w:r>
-      <w:r>
-        <w:t>• Các thuộc tính cốt lõi (Fields): recipientId (Ref User), senderId (Ref User), type ('submission_alert' | 'document_share' | 'promotion_unlocked'), title, message, documentUrl, documentName, targetGroup, isRead (Boolean).</w:t>
-      </w:r>
-    </w:p>
-    <w:p>
-      <w:pPr>
-        <w:pStyle w:val="Heading2"/>
-        <w:spacing w:before="200" w:after="60"/>
-      </w:pPr>
-      <w:r>
-        <w:rPr>
-          <w:rFonts w:ascii="Calibri" w:hAnsi="Calibri"/>
-          <w:b/>
-          <w:color w:val="2874A6"/>
-          <w:sz w:val="25"/>
-        </w:rPr>
-        <w:t>6. Lecture &amp; Exercise Schemas</w:t>
-      </w:r>
-    </w:p>
-    <w:p>
-      <w:r>
-        <w:rPr>
-          <w:b/>
-        </w:rPr>
-        <w:t>• Ý nghĩa: Bài giảng lý thuyết &amp; Bài tập tương tác DOL Format.</w:t>
-        <w:br/>
-      </w:r>
-      <w:r>
-        <w:t>• Các thuộc tính cốt lõi (Fields): Lecture: title, content (Markdown), focusCriterion, targetGroup.</w:t>
-        <w:br/>
-        <w:t>Exercise: lectureId (Ref Lecture), title, type ('gap-fill' | 'rewriting'), questions (Array).</w:t>
+        <w:t>• Tối ưu hóa hiệu năng: Tạo Indexing trên các trường truy vấn thường xuyên như `studentGroup`, `topic`, `recipientId` và `targetGroup` giúp tốc độ phản hồi API luôn &lt; 100ms.</w:t>
       </w:r>
     </w:p>
     <w:p/>
@@ -515,7 +631,7 @@
           <w:color w:val="1B4F72"/>
           <w:sz w:val="30"/>
         </w:rPr>
-        <w:t>3. CÁC LUỒNG XỬ LÝ DỮ LIỆU NỔI BẬT (CORE DATA FLOWS)</w:t>
+        <w:t>3. CHI TIẾT MONGOOSE SCHEMAS &amp; MỐI QUAN HỆ DỮ LIỆU</w:t>
       </w:r>
     </w:p>
     <w:p>
@@ -530,7 +646,7 @@
           <w:color w:val="2874A6"/>
           <w:sz w:val="25"/>
         </w:rPr>
-        <w:t>Luồng 1: Chấm bài IELTS Task 2 bằng AI GPT-4o &amp; Fallback Engine</w:t>
+        <w:t>User Model</w:t>
       </w:r>
     </w:p>
     <w:p>
@@ -538,49 +654,25 @@
         <w:rPr>
           <w:b/>
         </w:rPr>
-        <w:t>1. Client (Workspace.jsx)</w:t>
-      </w:r>
-      <w:r>
-        <w:t xml:space="preserve"> gửi request `POST /api/grading/submit` chứa `assignmentId` và `studentAnswers`.</w:t>
+        <w:t>• Chức năng: Lưu trữ tài khoản, vai trò và phân cấp học viên.</w:t>
         <w:br/>
       </w:r>
       <w:r>
-        <w:rPr>
-          <w:b/>
-        </w:rPr>
-        <w:t>2. Backend (grading.js)</w:t>
-      </w:r>
-      <w:r>
-        <w:t xml:space="preserve"> đọc cấu hình Rubric mới nhất từ MongoDB Collection `rubrics` để nhúng trực tiếp vào System Prompt.</w:t>
+        <w:t>• Cấu trúc chi tiết (Schema Fields):</w:t>
         <w:br/>
-      </w:r>
-      <w:r>
-        <w:rPr>
-          <w:b/>
-        </w:rPr>
-        <w:t>3. Gọi OpenAI API (gpt-4o)</w:t>
-      </w:r>
-      <w:r>
-        <w:t xml:space="preserve"> với `response_format: { type: 'json_object' }`. Nếu API gián đoạn/lỗi, hệ thống tự động kích hoạt </w:t>
-      </w:r>
-      <w:r>
-        <w:rPr>
-          <w:b/>
-        </w:rPr>
-        <w:t>Fallback Grading Engine</w:t>
-      </w:r>
-      <w:r>
-        <w:t xml:space="preserve"> nội bộ phân tích độ dài, độ phong phú từ vựng học thuật và cấu trúc câu để trả về điểm số khách quan.</w:t>
+        <w:t>• _id: ObjectId (Primary Key)</w:t>
         <w:br/>
-      </w:r>
-      <w:r>
-        <w:rPr>
-          <w:b/>
-        </w:rPr>
-        <w:t>4. Kết quả chấm</w:t>
-      </w:r>
-      <w:r>
-        <w:t xml:space="preserve"> bao gồm Overall Band, 4 tiêu chí TR/CC/LR/GRA, mảng `detailedCorrections` và `advancedVocabularyEnhancements` được lưu vào MongoDB `Submissions` và trả về Client hiển thị trên Interactive Result Canvas.</w:t>
+        <w:t>• name: String (Tên hiển thị)</w:t>
+        <w:br/>
+        <w:t>• email: String (Unique Index)</w:t>
+        <w:br/>
+        <w:t>• password: String (Hashed via bcrypt)</w:t>
+        <w:br/>
+        <w:t>• role: String ('student' | 'admin')</w:t>
+        <w:br/>
+        <w:t>• studentGroup: String ('support' | 'average' | 'excellent')</w:t>
+        <w:br/>
+        <w:t>• targetBand: Number (Mục tiêu điểm số của học viên)</w:t>
       </w:r>
     </w:p>
     <w:p>
@@ -595,7 +687,7 @@
           <w:color w:val="2874A6"/>
           <w:sz w:val="25"/>
         </w:rPr>
-        <w:t>Luồng 2: Thuật toán Thăng hạng &amp; Bài thi Chuyển Cấp (Level Migration)</w:t>
+        <w:t>Assignment Model</w:t>
       </w:r>
     </w:p>
     <w:p>
@@ -603,30 +695,27 @@
         <w:rPr>
           <w:b/>
         </w:rPr>
-        <w:t xml:space="preserve">1. Theo dõi bài nộp: </w:t>
-      </w:r>
-      <w:r>
-        <w:t>Sau mỗi lần nộp bài, hệ thống tính toán điểm số của học viên đối với các bài thi thuộc nhóm năng lực hiện tại.</w:t>
+        <w:t>• Chức năng: Quản lý kho đề thi &amp; Học liệu thích ứng.</w:t>
         <w:br/>
       </w:r>
       <w:r>
-        <w:rPr>
-          <w:b/>
-        </w:rPr>
-        <w:t xml:space="preserve">2. Mở khóa Bài Thi Chuyển Cấp: </w:t>
-      </w:r>
-      <w:r>
-        <w:t>Khi học viên hoàn thành đủ số bài quy định với điểm số đạt ngưỡng (Ví dụ: ≥ 5.5 Band cho nhóm Support), hệ thống tạo Notification `promotion_unlocked` mở khóa Bài thi Chuyển Cấp.</w:t>
+        <w:t>• Cấu trúc chi tiết (Schema Fields):</w:t>
         <w:br/>
-      </w:r>
-      <w:r>
-        <w:rPr>
-          <w:b/>
-        </w:rPr>
-        <w:t xml:space="preserve">3. Nộp bài Chuyển Cấp: </w:t>
-      </w:r>
-      <w:r>
-        <w:t>Khi học viên làm đề thi Chuyển Cấp, Client gửi request `POST /api/grading/submit-promotion-test`. Nếu điểm bài thi đạt ngưỡng (≥ 6.0 cho Support ➔ Average, ≥ 7.0 cho Average ➔ Excellent), hệ thống cập nhật thuộc tính `studentGroup` trong User Model và phát thông báo Chuyển cấp thành công.</w:t>
+        <w:t>• _id: ObjectId (Primary Key)</w:t>
+        <w:br/>
+        <w:t>• title: String (Tiêu đề đề thi)</w:t>
+        <w:br/>
+        <w:t>• prompt: String (Đề bài luận IELTS Task 2)</w:t>
+        <w:br/>
+        <w:t>• topic: String (Chủ đề: Education, Health, Environment...)</w:t>
+        <w:br/>
+        <w:t>• targetGroup: String ('support' | 'average' | 'excellent')</w:t>
+        <w:br/>
+        <w:t>• scaffoldingTemplate: String (Dàn ý 4 phần Mở - Thân 1 - Thân 2 - Kết)</w:t>
+        <w:br/>
+        <w:t>• groupSampleAnswers: Object { support, average, excellent } (3 bài mẫu 3 Band)</w:t>
+        <w:br/>
+        <w:t>• suggestedVocabulary: Array [{ word, meaning, collocation }]</w:t>
       </w:r>
     </w:p>
     <w:p>
@@ -641,7 +730,7 @@
           <w:color w:val="2874A6"/>
           <w:sz w:val="25"/>
         </w:rPr>
-        <w:t>Luồng 3: Quản lý Rubric Động &amp; Thông báo Hệ thống</w:t>
+        <w:t>Submission Model</w:t>
       </w:r>
     </w:p>
     <w:p>
@@ -649,22 +738,110 @@
         <w:rPr>
           <w:b/>
         </w:rPr>
-        <w:t xml:space="preserve">1. Quản lý Rubric: </w:t>
+        <w:t>• Chức năng: Lưu lịch sử bài nộp &amp; Bóc tách kết quả chấm AI.</w:t>
+        <w:br/>
       </w:r>
       <w:r>
-        <w:t>Admin truy cập `/admin/rubrics` để xem nội dung Rubric hiện tại hoặc chỉnh sửa mô tả từng Band điểm (5.0 - 8.0) và Coach Notes. Thay đổi được lưu vào MongoDB và áp dụng ngay lập tức cho bài chấm AI tiếp theo.</w:t>
+        <w:t>• Cấu trúc chi tiết (Schema Fields):</w:t>
         <w:br/>
+        <w:t>• _id: ObjectId (Primary Key)</w:t>
+        <w:br/>
+        <w:t>• studentId: ObjectId (Ref User)</w:t>
+        <w:br/>
+        <w:t>• assignmentId: ObjectId (Ref Assignment)</w:t>
+        <w:br/>
+        <w:t>• studentAnswers: String (Văn bản bài luận của học viên)</w:t>
+        <w:br/>
+        <w:t>• overallBand: Number (Điểm Overall trung bình cộng 4 tiêu chí)</w:t>
+        <w:br/>
+        <w:t>• criteriaScores: Object { TR: {score, feedback}, CC, LR, GRA }</w:t>
+        <w:br/>
+        <w:t>• detailedCorrections: Array [{ original, corrected, explanation }]</w:t>
+        <w:br/>
+        <w:t>• advancedVocabularyEnhancements: Array [{ originalWord, contextSentence, advancedSynonym, collocationUsage, explanation }]</w:t>
       </w:r>
+    </w:p>
+    <w:p>
+      <w:pPr>
+        <w:pStyle w:val="Heading2"/>
+        <w:spacing w:before="200" w:after="60"/>
+      </w:pPr>
+      <w:r>
+        <w:rPr>
+          <w:rFonts w:ascii="Calibri" w:hAnsi="Calibri"/>
+          <w:b/>
+          <w:color w:val="2874A6"/>
+          <w:sz w:val="25"/>
+        </w:rPr>
+        <w:t>Rubric Model</w:t>
+      </w:r>
+    </w:p>
+    <w:p>
       <w:r>
         <w:rPr>
           <w:b/>
         </w:rPr>
-        <w:t xml:space="preserve">2. Thông báo &amp; Tài liệu: </w:t>
+        <w:t>• Chức năng: Quản lý quy tắc chấm điểm động cho Admin.</w:t>
+        <w:br/>
       </w:r>
       <w:r>
-        <w:t>Admin có thể phát tài liệu tới từng học viên hoặc cả nhóm. Hệ thống tích hợp HTTP Polling (30s) trên Navbar để đảm bảo thông báo được cập nhật tin cậy ngay cả trên môi trường Serverless (Vercel).</w:t>
+        <w:t>• Cấu trúc chi tiết (Schema Fields):</w:t>
+        <w:br/>
+        <w:t>• _id: ObjectId (Primary Key)</w:t>
+        <w:br/>
+        <w:t>• criterionKey: String ('TR' | 'CC' | 'LR' | 'GRA' - Unique Index)</w:t>
+        <w:br/>
+        <w:t>• name: String (Tên đầy đủ tiêu chí)</w:t>
+        <w:br/>
+        <w:t>• description: String (Mô tả tiêu chí)</w:t>
+        <w:br/>
+        <w:t>• bands: Object { 5: String, 6: String, 7: String, 8: String }</w:t>
+        <w:br/>
+        <w:t>• coachNotes: Object { '5-6': String, '6-7': String, '7-8': String }</w:t>
       </w:r>
     </w:p>
+    <w:p>
+      <w:pPr>
+        <w:pStyle w:val="Heading2"/>
+        <w:spacing w:before="200" w:after="60"/>
+      </w:pPr>
+      <w:r>
+        <w:rPr>
+          <w:rFonts w:ascii="Calibri" w:hAnsi="Calibri"/>
+          <w:b/>
+          <w:color w:val="2874A6"/>
+          <w:sz w:val="25"/>
+        </w:rPr>
+        <w:t>Notification Model</w:t>
+      </w:r>
+    </w:p>
+    <w:p>
+      <w:r>
+        <w:rPr>
+          <w:b/>
+        </w:rPr>
+        <w:t>• Chức năng: Lịch sử thông báo &amp; Kho tài liệu học tập.</w:t>
+        <w:br/>
+      </w:r>
+      <w:r>
+        <w:t>• Cấu trúc chi tiết (Schema Fields):</w:t>
+        <w:br/>
+        <w:t>• _id: ObjectId (Primary Key)</w:t>
+        <w:br/>
+        <w:t>• recipientId: ObjectId (Ref User)</w:t>
+        <w:br/>
+        <w:t>• senderId: ObjectId (Ref User)</w:t>
+        <w:br/>
+        <w:t>• type: String ('submission_alert' | 'document_share' | 'promotion_unlocked')</w:t>
+        <w:br/>
+        <w:t>• title: String, message: String</w:t>
+        <w:br/>
+        <w:t>• documentUrl: String, documentName: String</w:t>
+        <w:br/>
+        <w:t>• targetGroup: String, isRead: Boolean</w:t>
+      </w:r>
+    </w:p>
+    <w:p/>
     <w:p>
       <w:pPr>
         <w:pStyle w:val="Heading1"/>
@@ -677,48 +854,65 @@
           <w:color w:val="1B4F72"/>
           <w:sz w:val="30"/>
         </w:rPr>
-        <w:t>4. TÍNH AN TOÀN, BẢO MẬT VÀ KHẢ NĂNG MỞ RỘNG (SECURITY &amp; SCALABILITY)</w:t>
+        <w:t>4. SƠ ĐỒ LUỒNG XỬ LÝ DỮ LIỆU CỐT LÕI (DATA SEQUENCE FLOWS)</w:t>
+      </w:r>
+    </w:p>
+    <w:p>
+      <w:pPr>
+        <w:pStyle w:val="Heading2"/>
+        <w:spacing w:before="200" w:after="60"/>
+      </w:pPr>
+      <w:r>
+        <w:rPr>
+          <w:rFonts w:ascii="Calibri" w:hAnsi="Calibri"/>
+          <w:b/>
+          <w:color w:val="2874A6"/>
+          <w:sz w:val="25"/>
+        </w:rPr>
+        <w:t>4.1 Luồng Chấm Bài AI &amp; Phản Hồi Trực Quan (Grading Data Flow)</w:t>
       </w:r>
     </w:p>
     <w:p>
       <w:r>
-        <w:rPr>
-          <w:b/>
-        </w:rPr>
-        <w:t xml:space="preserve">• Bảo mật xác thực: </w:t>
+        <w:t>1. Học viên nộp bài tại Workspace ➔ Client gửi HTTP POST tới `/api/grading/submit`.</w:t>
+        <w:br/>
+        <w:t>2. Backend đọc dữ liệu Rubric mới nhất từ MongoDB `rubrics` collection.</w:t>
+        <w:br/>
+        <w:t>3. Backend khởi tạo request gửi tới OpenAI GPT-4o API với System Prompt khắt khe.</w:t>
+        <w:br/>
+        <w:t>4. GPT-4o phân tích bài viết và trả về định dạng JSON thuần chứa điểm 4 tiêu chí &amp; danh sách câu sai.</w:t>
+        <w:br/>
+        <w:t>5. Backend lưu bản ghi vào `submissions` collection, đồng thời tự động tạo Notification gửi cho Admin.</w:t>
+        <w:br/>
+        <w:t>6. Client nhận kết quả và render Bản đồ Sửa lỗi Trực quan (Corrections Canvas) với hiệu ứng Tooltip Popover.</w:t>
       </w:r>
-      <w:r>
-        <w:t>Sử dụng JSON Web Token (JWT) có thời hạn, mật khẩu người dùng được băm mã hóa bằng bcrypt với Salt Rounds = 10.</w:t>
-        <w:br/>
-      </w:r>
+    </w:p>
+    <w:p>
+      <w:pPr>
+        <w:pStyle w:val="Heading2"/>
+        <w:spacing w:before="200" w:after="60"/>
+      </w:pPr>
       <w:r>
         <w:rPr>
+          <w:rFonts w:ascii="Calibri" w:hAnsi="Calibri"/>
           <w:b/>
+          <w:color w:val="2874A6"/>
+          <w:sz w:val="25"/>
         </w:rPr>
-        <w:t xml:space="preserve">• Phân quyền nghiêm ngặt (Middleware Authorization): </w:t>
+        <w:t>4.2 Luồng Thăng Hạng &amp; Bài Thi Chuyển Cấp (Level Migration Data Flow)</w:t>
       </w:r>
+    </w:p>
+    <w:p>
       <w:r>
-        <w:t>Middleware `requireAdmin` bảo vệ tất cả các API quản trị (`/api/rubrics`, `/api/assignments`, `/api/resources`).</w:t>
+        <w:t>1. Học viên hoàn thành các bài thi trong nhóm năng lực hiện tại.</w:t>
         <w:br/>
-      </w:r>
-      <w:r>
-        <w:rPr>
-          <w:b/>
-        </w:rPr>
-        <w:t xml:space="preserve">• Khả năng chịu lỗi (Fault Tolerance): </w:t>
-      </w:r>
-      <w:r>
-        <w:t>Có engine fallback grading chấm điểm offline khi mất kết nối API OpenAI, đảm bảo trải nghiệm người dùng không bị đứt gãy.</w:t>
+        <w:t>2. Backend tính điểm trung bình di động (Moving Average) và kiểm tra số lượng bài hoàn thành đạt chuẩn.</w:t>
         <w:br/>
-      </w:r>
-      <w:r>
-        <w:rPr>
-          <w:b/>
-        </w:rPr>
-        <w:t xml:space="preserve">• Chuẩn bị mở rộng: </w:t>
-      </w:r>
-      <w:r>
-        <w:t>CSDL MongoDB Indexing được thiết lập sẵn trên `studentGroup`, `topic`, `recipientId` giúp hệ thống giữ được tốc độ truy vấn cao khi quy mô học viên tăng trưởng.</w:t>
+        <w:t>3. Nếu đủ điều kiện ➔ Hệ thống phát thông báo `promotion_unlocked` mở khóa Bài thi Chuyển Cấp.</w:t>
+        <w:br/>
+        <w:t>4. Học viên làm Bài thi Chuyển Cấp ➔ Client gửi request tới `/api/grading/submit-promotion-test`.</w:t>
+        <w:br/>
+        <w:t>5. Nếu điểm số ≥ điểm sàn yêu cầu (≥ 6.0 cho Support ➔ Average, ≥ 7.0 cho Average ➔ Excellent) ➔ Backend cập nhật `studentGroup` mới trong User Model và phát thông báo chuyển cấp thành công.</w:t>
       </w:r>
     </w:p>
     <w:sectPr>

</xml_diff>

<commit_message>
Update TAI_LIEU_KIEN_TRUC_HE_THONG_LMS.docx: use simple clear Activity Diagram at top and detailed architecture section below
</commit_message>
<xml_diff>
--- a/TAI_LIEU_KIEN_TRUC_HE_THONG_LMS.docx
+++ b/TAI_LIEU_KIEN_TRUC_HE_THONG_LMS.docx
@@ -40,9 +40,9 @@
               <w:rPr>
                 <w:b/>
                 <w:color w:val="FFFFFF"/>
-                <w:sz w:val="32"/>
+                <w:sz w:val="30"/>
               </w:rPr>
-              <w:t>TÀI LIỆU CHI TIẾT KIẾN TRÚC HỆ THỐNG &amp; SƠ ĐỒ LUỒNG DỮ LIỆU</w:t>
+              <w:t>TÀI LIỆU TÓM TẮT KIẾN TRÚC HỆ THỐNG &amp; SƠ ĐỒ HOẠT ĐỘNG (ACTIVITY DIAGRAM)</w:t>
               <w:br/>
               <w:t>ENGLISH ADAPTIVE LMS (TRACK A)</w:t>
             </w:r>
@@ -63,12 +63,12 @@
           <w:color w:val="1B4F72"/>
           <w:sz w:val="30"/>
         </w:rPr>
-        <w:t>1. SƠ ĐỒ KIẾN TRÚC HỆ THỐNG (SYSTEM ARCHITECTURE DIAGRAM)</w:t>
+        <w:t>1. SƠ ĐỒ HOẠT ĐỘNG TỔNG QUAN HỆ THỐNG (SYSTEM ACTIVITY DIAGRAM)</w:t>
       </w:r>
     </w:p>
     <w:p>
       <w:r>
-        <w:t>Dưới đây là sơ đồ khối kiến trúc hệ thống 3 tầng (Three-Tier Architecture Diagram) mô tả luồng tương tác giữa Người dùng (Học viên &amp; Admin), Giao diện Web Client, Server Backend Node.js, Engine AI GPT-4o và Cơ sở dữ liệu MongoDB Cloud Atlas:</w:t>
+        <w:t>Sơ đồ Activity dưới đây thể hiện luồng hoạt động tổng quan gọn gàng, trực quan từ khi Học viên / Admin truy cập hệ thống cho đến khi hoàn thành chấm bài AI và thăng hạng nhóm năng lực:</w:t>
       </w:r>
     </w:p>
     <w:tbl>
@@ -78,19 +78,16 @@
         <w:tblLook w:firstColumn="1" w:firstRow="1" w:lastColumn="0" w:lastRow="0" w:noHBand="0" w:noVBand="1" w:val="04A0"/>
       </w:tblPr>
       <w:tblGrid>
-        <w:gridCol w:w="3312"/>
-        <w:gridCol w:w="3312"/>
-        <w:gridCol w:w="3312"/>
+        <w:gridCol w:w="9936"/>
       </w:tblGrid>
       <w:tr>
         <w:tc>
           <w:tcPr>
-            <w:tcW w:type="dxa" w:w="9936"/>
-            <w:gridSpan w:val="3"/>
+            <w:tcW w:type="dxa" w:w="9792"/>
             <w:shd w:fill="1B4F72"/>
             <w:tcMar>
-              <w:top w:w="100" w:type="dxa"/>
-              <w:bottom w:w="100" w:type="dxa"/>
+              <w:top w:w="70" w:type="dxa"/>
+              <w:bottom w:w="70" w:type="dxa"/>
               <w:left w:w="100" w:type="dxa"/>
               <w:right w:w="100" w:type="dxa"/>
             </w:tcMar>
@@ -103,9 +100,9 @@
               <w:rPr>
                 <w:b/>
                 <w:color w:val="FFFFFF"/>
-                <w:sz w:val="21"/>
+                <w:sz w:val="20"/>
               </w:rPr>
-              <w:t>🖥️ USER INTERFACE LAYER (REACTJS + VITE + TAILWIND CSS)</w:t>
+              <w:t>🟢 [START] Người dùng truy cập Hệ thống English Adaptive LMS</w:t>
             </w:r>
           </w:p>
         </w:tc>
@@ -113,58 +110,26 @@
       <w:tr>
         <w:tc>
           <w:tcPr>
-            <w:tcW w:type="dxa" w:w="4752"/>
-            <w:shd w:fill="EBF5FB"/>
+            <w:tcW w:type="dxa" w:w="9792"/>
+            <w:shd w:fill="FFFFFF"/>
             <w:tcMar>
-              <w:top w:w="80" w:type="dxa"/>
-              <w:bottom w:w="80" w:type="dxa"/>
+              <w:top w:w="70" w:type="dxa"/>
+              <w:bottom w:w="70" w:type="dxa"/>
               <w:left w:w="100" w:type="dxa"/>
               <w:right w:w="100" w:type="dxa"/>
             </w:tcMar>
           </w:tcPr>
           <w:p>
+            <w:pPr>
+              <w:jc w:val="center"/>
+            </w:pPr>
             <w:r>
               <w:rPr>
-                <w:sz w:val="19"/>
+                <w:b w:val="0"/>
+                <w:color w:val="2874A6"/>
+                <w:sz w:val="24"/>
               </w:rPr>
-              <w:t>🎓 Student Interface:</w:t>
-              <w:br/>
-              <w:t>- Dashboard tiến độ Recharts</w:t>
-              <w:br/>
-              <w:t>- Workspace làm bài thích ứng</w:t>
-              <w:br/>
-              <w:t>- Corrections Canvas bóc tách lỗi</w:t>
-              <w:br/>
-              <w:t>- Kho tài liệu cá nhân</w:t>
-            </w:r>
-          </w:p>
-        </w:tc>
-        <w:tc>
-          <w:tcPr>
-            <w:tcW w:type="dxa" w:w="5184"/>
-            <w:gridSpan w:val="2"/>
-            <w:shd w:fill="EBF5FB"/>
-            <w:tcMar>
-              <w:top w:w="80" w:type="dxa"/>
-              <w:bottom w:w="80" w:type="dxa"/>
-              <w:left w:w="100" w:type="dxa"/>
-              <w:right w:w="100" w:type="dxa"/>
-            </w:tcMar>
-          </w:tcPr>
-          <w:p>
-            <w:r>
-              <w:rPr>
-                <w:sz w:val="19"/>
-              </w:rPr>
-              <w:t>👑 Admin Interface:</w:t>
-              <w:br/>
-              <w:t>- Kho Đề thi &amp; AI Generator</w:t>
-              <w:br/>
-              <w:t>- Quản lý Rubric Động</w:t>
-              <w:br/>
-              <w:t>- Giám sát học viên &amp; Override</w:t>
-              <w:br/>
-              <w:t>- Chia sẻ tài liệu Realtime</w:t>
+              <w:t>⬇️</w:t>
             </w:r>
           </w:p>
         </w:tc>
@@ -172,12 +137,11 @@
       <w:tr>
         <w:tc>
           <w:tcPr>
-            <w:tcW w:type="dxa" w:w="9936"/>
-            <w:gridSpan w:val="3"/>
+            <w:tcW w:type="dxa" w:w="9792"/>
             <w:shd w:fill="2874A6"/>
             <w:tcMar>
-              <w:top w:w="100" w:type="dxa"/>
-              <w:bottom w:w="100" w:type="dxa"/>
+              <w:top w:w="70" w:type="dxa"/>
+              <w:bottom w:w="70" w:type="dxa"/>
               <w:left w:w="100" w:type="dxa"/>
               <w:right w:w="100" w:type="dxa"/>
             </w:tcMar>
@@ -190,9 +154,9 @@
               <w:rPr>
                 <w:b/>
                 <w:color w:val="FFFFFF"/>
-                <w:sz w:val="21"/>
+                <w:sz w:val="20"/>
               </w:rPr>
-              <w:t>⬇️ REST API / JSON over HTTP (Bearer JWT Authorization) &amp; Polling 30s ⬆️</w:t>
+              <w:t>🔑 Đăng nhập / Đăng ký (Xác thực JWT Token &amp; Phân quyền Role: Học viên hoặc Admin)</w:t>
             </w:r>
           </w:p>
         </w:tc>
@@ -200,11 +164,38 @@
       <w:tr>
         <w:tc>
           <w:tcPr>
-            <w:tcW w:type="dxa" w:w="3312"/>
+            <w:tcW w:type="dxa" w:w="9792"/>
+            <w:shd w:fill="FFFFFF"/>
+            <w:tcMar>
+              <w:top w:w="70" w:type="dxa"/>
+              <w:bottom w:w="70" w:type="dxa"/>
+              <w:left w:w="100" w:type="dxa"/>
+              <w:right w:w="100" w:type="dxa"/>
+            </w:tcMar>
+          </w:tcPr>
+          <w:p>
+            <w:pPr>
+              <w:jc w:val="center"/>
+            </w:pPr>
+            <w:r>
+              <w:rPr>
+                <w:b w:val="0"/>
+                <w:color w:val="2874A6"/>
+                <w:sz w:val="24"/>
+              </w:rPr>
+              <w:t>⬇️</w:t>
+            </w:r>
+          </w:p>
+        </w:tc>
+      </w:tr>
+      <w:tr>
+        <w:tc>
+          <w:tcPr>
+            <w:tcW w:type="dxa" w:w="9792"/>
             <w:shd w:fill="1F618D"/>
             <w:tcMar>
-              <w:top w:w="100" w:type="dxa"/>
-              <w:bottom w:w="100" w:type="dxa"/>
+              <w:top w:w="70" w:type="dxa"/>
+              <w:bottom w:w="70" w:type="dxa"/>
               <w:left w:w="100" w:type="dxa"/>
               <w:right w:w="100" w:type="dxa"/>
             </w:tcMar>
@@ -217,69 +208,13 @@
               <w:rPr>
                 <w:b/>
                 <w:color w:val="FFFFFF"/>
-                <w:sz w:val="21"/>
+                <w:sz w:val="20"/>
               </w:rPr>
-              <w:t>⚙️ APPLICATION &amp; LOGIC LAYER (NODE.JS + EXPRESSJS BACKEND)</w:t>
-            </w:r>
-          </w:p>
-        </w:tc>
-        <w:tc>
-          <w:tcPr>
-            <w:tcW w:type="dxa" w:w="3312"/>
-          </w:tcPr>
-          <w:p/>
-        </w:tc>
-        <w:tc>
-          <w:tcPr>
-            <w:tcW w:type="dxa" w:w="3312"/>
-          </w:tcPr>
-          <w:p/>
-        </w:tc>
-      </w:tr>
-      <w:tr>
-        <w:tc>
-          <w:tcPr>
-            <w:tcW w:type="dxa" w:w="5184"/>
-            <w:gridSpan w:val="3"/>
-            <w:shd w:fill="EBF5FB"/>
-            <w:shd w:fill="EBF5FB"/>
-            <w:tcMar>
-              <w:top w:w="80" w:type="dxa"/>
-              <w:bottom w:w="80" w:type="dxa"/>
-              <w:left w:w="100" w:type="dxa"/>
-              <w:right w:w="100" w:type="dxa"/>
-            </w:tcMar>
-            <w:tcMar>
-              <w:top w:w="80" w:type="dxa"/>
-              <w:bottom w:w="80" w:type="dxa"/>
-              <w:left w:w="100" w:type="dxa"/>
-              <w:right w:w="100" w:type="dxa"/>
-            </w:tcMar>
-          </w:tcPr>
-          <w:p>
-            <w:r>
-              <w:rPr>
-                <w:sz w:val="19"/>
-              </w:rPr>
-              <w:t>🔑 Auth &amp; Authorization:</w:t>
+              <w:t>🎯 PHÂN LUỒNG VÀO TRANG TRỦ THÍCH ỨNG (ADAPTIVE ROUTING)</w:t>
               <w:br/>
-              <w:t>- JWT Token Verifier</w:t>
+              <w:t>• Học viên: Kiểm tra studentGroup (support / average / excellent) ➔ Tải Kho đề thi &amp; Workspace với Adaptive Sidebar tương ứng.</w:t>
               <w:br/>
-              <w:t>- Role Middleware (requireAdmin)</w:t>
-              <w:br/>
-              <w:t>- Password Bcrypt Hashing</w:t>
-            </w:r>
-            <w:r>
-              <w:rPr>
-                <w:sz w:val="19"/>
-              </w:rPr>
-              <w:t>🔄 Adaptive Engine:</w:t>
-              <w:br/>
-              <w:t>- Moving Average Level Migration</w:t>
-              <w:br/>
-              <w:t>- Group Filtering (support/avg/exc)</w:t>
-              <w:br/>
-              <w:t>- Placement &amp; Promotion Router</w:t>
+              <w:t>• Admin: Mở trang Quản trị (Quản lý Đề thi, Giám sát Học viên, Cấu hình Rubric Động).</w:t>
             </w:r>
           </w:p>
         </w:tc>
@@ -287,11 +222,38 @@
       <w:tr>
         <w:tc>
           <w:tcPr>
-            <w:tcW w:type="dxa" w:w="3312"/>
-            <w:shd w:fill="2874A6"/>
+            <w:tcW w:type="dxa" w:w="9792"/>
+            <w:shd w:fill="FFFFFF"/>
             <w:tcMar>
-              <w:top w:w="100" w:type="dxa"/>
-              <w:bottom w:w="100" w:type="dxa"/>
+              <w:top w:w="70" w:type="dxa"/>
+              <w:bottom w:w="70" w:type="dxa"/>
+              <w:left w:w="100" w:type="dxa"/>
+              <w:right w:w="100" w:type="dxa"/>
+            </w:tcMar>
+          </w:tcPr>
+          <w:p>
+            <w:pPr>
+              <w:jc w:val="center"/>
+            </w:pPr>
+            <w:r>
+              <w:rPr>
+                <w:b w:val="0"/>
+                <w:color w:val="2874A6"/>
+                <w:sz w:val="24"/>
+              </w:rPr>
+              <w:t>⬇️</w:t>
+            </w:r>
+          </w:p>
+        </w:tc>
+      </w:tr>
+      <w:tr>
+        <w:tc>
+          <w:tcPr>
+            <w:tcW w:type="dxa" w:w="9792"/>
+            <w:shd w:fill="21618C"/>
+            <w:tcMar>
+              <w:top w:w="70" w:type="dxa"/>
+              <w:bottom w:w="70" w:type="dxa"/>
               <w:left w:w="100" w:type="dxa"/>
               <w:right w:w="100" w:type="dxa"/>
             </w:tcMar>
@@ -304,34 +266,50 @@
               <w:rPr>
                 <w:b/>
                 <w:color w:val="FFFFFF"/>
-                <w:sz w:val="21"/>
+                <w:sz w:val="20"/>
               </w:rPr>
-              <w:t>⬇️ Inter-Service Integration &amp; Database Query ⬆️</w:t>
+              <w:t>✍️ HỌC VIÊN LÀM BÀI VÀ NỘP BÀI LUẬN (WORKSPACE)</w:t>
+              <w:br/>
+              <w:t>Học viên viết bài luận ➔ Bấm 'Nộp Bài Chấm AI' ➔ Client gửi Payload về Backend.</w:t>
             </w:r>
           </w:p>
-        </w:tc>
-        <w:tc>
-          <w:tcPr>
-            <w:tcW w:type="dxa" w:w="3312"/>
-          </w:tcPr>
-          <w:p/>
-        </w:tc>
-        <w:tc>
-          <w:tcPr>
-            <w:tcW w:type="dxa" w:w="3312"/>
-          </w:tcPr>
-          <w:p/>
         </w:tc>
       </w:tr>
       <w:tr>
         <w:tc>
           <w:tcPr>
-            <w:tcW w:type="dxa" w:w="9936"/>
-            <w:gridSpan w:val="3"/>
+            <w:tcW w:type="dxa" w:w="9792"/>
+            <w:shd w:fill="FFFFFF"/>
+            <w:tcMar>
+              <w:top w:w="70" w:type="dxa"/>
+              <w:bottom w:w="70" w:type="dxa"/>
+              <w:left w:w="100" w:type="dxa"/>
+              <w:right w:w="100" w:type="dxa"/>
+            </w:tcMar>
+          </w:tcPr>
+          <w:p>
+            <w:pPr>
+              <w:jc w:val="center"/>
+            </w:pPr>
+            <w:r>
+              <w:rPr>
+                <w:b w:val="0"/>
+                <w:color w:val="2874A6"/>
+                <w:sz w:val="24"/>
+              </w:rPr>
+              <w:t>⬇️</w:t>
+            </w:r>
+          </w:p>
+        </w:tc>
+      </w:tr>
+      <w:tr>
+        <w:tc>
+          <w:tcPr>
+            <w:tcW w:type="dxa" w:w="9792"/>
             <w:shd w:fill="4A235A"/>
             <w:tcMar>
-              <w:top w:w="100" w:type="dxa"/>
-              <w:bottom w:w="100" w:type="dxa"/>
+              <w:top w:w="70" w:type="dxa"/>
+              <w:bottom w:w="70" w:type="dxa"/>
               <w:left w:w="100" w:type="dxa"/>
               <w:right w:w="100" w:type="dxa"/>
             </w:tcMar>
@@ -344,9 +322,15 @@
               <w:rPr>
                 <w:b/>
                 <w:color w:val="FFFFFF"/>
-                <w:sz w:val="21"/>
+                <w:sz w:val="20"/>
               </w:rPr>
-              <w:t>🤖 EXTERNAL AI SERVICES &amp; FALLBACK ENGINE</w:t>
+              <w:t>🤖 BACKEND GỌI AI GPT-4O CHẤM BÀI THEO RUBRIC DÒNG (JSON MODE)</w:t>
+              <w:br/>
+              <w:t>• Đọc Rubric mới nhất từ CSDL MongoDB.</w:t>
+              <w:br/>
+              <w:t>• Gửi request tới GPT-4o ➔ Trả kết quả Band Overall + 4 tiêu chí (TR, CC, LR, GRA) + Chi tiết bóc tách câu sai.</w:t>
+              <w:br/>
+              <w:t>• (Nếu API gián đoạn ➔ Tự động kích hoạt Internal Fallback Engine).</w:t>
             </w:r>
           </w:p>
         </w:tc>
@@ -354,54 +338,26 @@
       <w:tr>
         <w:tc>
           <w:tcPr>
-            <w:tcW w:type="dxa" w:w="4752"/>
-            <w:shd w:fill="F5EEF8"/>
+            <w:tcW w:type="dxa" w:w="9792"/>
+            <w:shd w:fill="FFFFFF"/>
             <w:tcMar>
-              <w:top w:w="80" w:type="dxa"/>
-              <w:bottom w:w="80" w:type="dxa"/>
+              <w:top w:w="70" w:type="dxa"/>
+              <w:bottom w:w="70" w:type="dxa"/>
               <w:left w:w="100" w:type="dxa"/>
               <w:right w:w="100" w:type="dxa"/>
             </w:tcMar>
           </w:tcPr>
           <w:p>
+            <w:pPr>
+              <w:jc w:val="center"/>
+            </w:pPr>
             <w:r>
               <w:rPr>
-                <w:sz w:val="19"/>
+                <w:b w:val="0"/>
+                <w:color w:val="2874A6"/>
+                <w:sz w:val="24"/>
               </w:rPr>
-              <w:t>🧠 OpenAI GPT-4o Engine:</w:t>
-              <w:br/>
-              <w:t>- JSON Mode System Prompt</w:t>
-              <w:br/>
-              <w:t>- IELTS Writing Band Descriptors</w:t>
-              <w:br/>
-              <w:t>- Dynamic Rubric Injection</w:t>
-            </w:r>
-          </w:p>
-        </w:tc>
-        <w:tc>
-          <w:tcPr>
-            <w:tcW w:type="dxa" w:w="5184"/>
-            <w:gridSpan w:val="2"/>
-            <w:shd w:fill="F5EEF8"/>
-            <w:tcMar>
-              <w:top w:w="80" w:type="dxa"/>
-              <w:bottom w:w="80" w:type="dxa"/>
-              <w:left w:w="100" w:type="dxa"/>
-              <w:right w:w="100" w:type="dxa"/>
-            </w:tcMar>
-          </w:tcPr>
-          <w:p>
-            <w:r>
-              <w:rPr>
-                <w:sz w:val="19"/>
-              </w:rPr>
-              <w:t>🛡️ Fallback Grading Engine:</w:t>
-              <w:br/>
-              <w:t>- Academic Vocab Analysis</w:t>
-              <w:br/>
-              <w:t>- Length &amp; Diversity Ratio</w:t>
-              <w:br/>
-              <w:t>- Offline Scoring Algorithm</w:t>
+              <w:t>⬇️</w:t>
             </w:r>
           </w:p>
         </w:tc>
@@ -409,12 +365,11 @@
       <w:tr>
         <w:tc>
           <w:tcPr>
-            <w:tcW w:type="dxa" w:w="9936"/>
-            <w:gridSpan w:val="3"/>
-            <w:shd w:fill="2874A6"/>
+            <w:tcW w:type="dxa" w:w="9792"/>
+            <w:shd w:fill="117A65"/>
             <w:tcMar>
-              <w:top w:w="100" w:type="dxa"/>
-              <w:bottom w:w="100" w:type="dxa"/>
+              <w:top w:w="70" w:type="dxa"/>
+              <w:bottom w:w="70" w:type="dxa"/>
               <w:left w:w="100" w:type="dxa"/>
               <w:right w:w="100" w:type="dxa"/>
             </w:tcMar>
@@ -427,9 +382,13 @@
               <w:rPr>
                 <w:b/>
                 <w:color w:val="FFFFFF"/>
-                <w:sz w:val="21"/>
+                <w:sz w:val="20"/>
               </w:rPr>
-              <w:t>⬇️ Mongoose ODM Connection Protocol (MongoDB Wire Protocol) ⬆️</w:t>
+              <w:t>📊 KẾT QUẢ VÀ BẢN ĐỒ SỬA LỖI TRỰC QUAN (INTERACTIVE RESULT)</w:t>
+              <w:br/>
+              <w:t>• Render Band điểm &amp; Thẻ bóc tách câu sai bôi đỏ (Corrections Canvas + Tooltip Popover).</w:t>
+              <w:br/>
+              <w:t>• Cập nhật Biểu đồ Tiến độ Recharts di động 4 tiêu chí.</w:t>
             </w:r>
           </w:p>
         </w:tc>
@@ -437,11 +396,38 @@
       <w:tr>
         <w:tc>
           <w:tcPr>
-            <w:tcW w:type="dxa" w:w="3312"/>
-            <w:shd w:fill="117A65"/>
+            <w:tcW w:type="dxa" w:w="9792"/>
+            <w:shd w:fill="FFFFFF"/>
             <w:tcMar>
-              <w:top w:w="100" w:type="dxa"/>
-              <w:bottom w:w="100" w:type="dxa"/>
+              <w:top w:w="70" w:type="dxa"/>
+              <w:bottom w:w="70" w:type="dxa"/>
+              <w:left w:w="100" w:type="dxa"/>
+              <w:right w:w="100" w:type="dxa"/>
+            </w:tcMar>
+          </w:tcPr>
+          <w:p>
+            <w:pPr>
+              <w:jc w:val="center"/>
+            </w:pPr>
+            <w:r>
+              <w:rPr>
+                <w:b w:val="0"/>
+                <w:color w:val="2874A6"/>
+                <w:sz w:val="24"/>
+              </w:rPr>
+              <w:t>⬇️</w:t>
+            </w:r>
+          </w:p>
+        </w:tc>
+      </w:tr>
+      <w:tr>
+        <w:tc>
+          <w:tcPr>
+            <w:tcW w:type="dxa" w:w="9792"/>
+            <w:shd w:fill="D35400"/>
+            <w:tcMar>
+              <w:top w:w="70" w:type="dxa"/>
+              <w:bottom w:w="70" w:type="dxa"/>
               <w:left w:w="100" w:type="dxa"/>
               <w:right w:w="100" w:type="dxa"/>
             </w:tcMar>
@@ -454,69 +440,67 @@
               <w:rPr>
                 <w:b/>
                 <w:color w:val="FFFFFF"/>
-                <w:sz w:val="21"/>
+                <w:sz w:val="20"/>
               </w:rPr>
-              <w:t>🗄️ PERSISTENT DATA LAYER (MONGODB ATLAS CLOUD CLUSTER)</w:t>
+              <w:t>🏆 ĐÁNH GIÁ THĂNG HẠNG (LEVEL MIGRATION ENGINE)</w:t>
+              <w:br/>
+              <w:t>• Kiểm tra số bài hoàn thành &amp; Điểm di động (Moving Average).</w:t>
+              <w:br/>
+              <w:t>• Nếu đạt chuẩn ➔ Phát thông báo mở khóa 'Bài Thi Chuyển Cấp' ➔ Thi đỗ ➔ Cập nhật studentGroup mới.</w:t>
             </w:r>
           </w:p>
-        </w:tc>
-        <w:tc>
-          <w:tcPr>
-            <w:tcW w:type="dxa" w:w="3312"/>
-          </w:tcPr>
-          <w:p/>
-        </w:tc>
-        <w:tc>
-          <w:tcPr>
-            <w:tcW w:type="dxa" w:w="3312"/>
-          </w:tcPr>
-          <w:p/>
         </w:tc>
       </w:tr>
       <w:tr>
         <w:tc>
           <w:tcPr>
-            <w:tcW w:type="dxa" w:w="5184"/>
-            <w:gridSpan w:val="3"/>
-            <w:shd w:fill="E8F8F5"/>
-            <w:shd w:fill="E8F8F5"/>
+            <w:tcW w:type="dxa" w:w="9792"/>
+            <w:shd w:fill="FFFFFF"/>
             <w:tcMar>
-              <w:top w:w="80" w:type="dxa"/>
-              <w:bottom w:w="80" w:type="dxa"/>
-              <w:left w:w="100" w:type="dxa"/>
-              <w:right w:w="100" w:type="dxa"/>
-            </w:tcMar>
-            <w:tcMar>
-              <w:top w:w="80" w:type="dxa"/>
-              <w:bottom w:w="80" w:type="dxa"/>
+              <w:top w:w="70" w:type="dxa"/>
+              <w:bottom w:w="70" w:type="dxa"/>
               <w:left w:w="100" w:type="dxa"/>
               <w:right w:w="100" w:type="dxa"/>
             </w:tcMar>
           </w:tcPr>
           <w:p>
+            <w:pPr>
+              <w:jc w:val="center"/>
+            </w:pPr>
             <w:r>
               <w:rPr>
-                <w:sz w:val="19"/>
+                <w:b w:val="0"/>
+                <w:color w:val="2874A6"/>
+                <w:sz w:val="24"/>
               </w:rPr>
-              <w:t>📊 Collections:</w:t>
-              <w:br/>
-              <w:t>- Users (auth &amp; studentGroup)</w:t>
-              <w:br/>
-              <w:t>- Assignments (scaffolding &amp; samples)</w:t>
-              <w:br/>
-              <w:t>- Submissions (band &amp; corrections)</w:t>
+              <w:t>⬇️</w:t>
             </w:r>
+          </w:p>
+        </w:tc>
+      </w:tr>
+      <w:tr>
+        <w:tc>
+          <w:tcPr>
+            <w:tcW w:type="dxa" w:w="9792"/>
+            <w:shd w:fill="17202A"/>
+            <w:tcMar>
+              <w:top w:w="70" w:type="dxa"/>
+              <w:bottom w:w="70" w:type="dxa"/>
+              <w:left w:w="100" w:type="dxa"/>
+              <w:right w:w="100" w:type="dxa"/>
+            </w:tcMar>
+          </w:tcPr>
+          <w:p>
+            <w:pPr>
+              <w:jc w:val="center"/>
+            </w:pPr>
             <w:r>
               <w:rPr>
-                <w:sz w:val="19"/>
+                <w:b/>
+                <w:color w:val="FFFFFF"/>
+                <w:sz w:val="20"/>
               </w:rPr>
-              <w:t>⚙️ Management Collections:</w:t>
-              <w:br/>
-              <w:t>- Rubrics (dynamic scoring rules)</w:t>
-              <w:br/>
-              <w:t>- Notifications (alerts &amp; resources)</w:t>
-              <w:br/>
-              <w:t>- Lectures &amp; Exercises (DOL Format)</w:t>
+              <w:t>🔴 [END] Hoàn thành chu trình học tập thích ứng &amp; Lưu lịch sử bền vững vào MongoDB Atlas</w:t>
             </w:r>
           </w:p>
         </w:tc>
@@ -535,7 +519,7 @@
           <w:color w:val="1B4F72"/>
           <w:sz w:val="30"/>
         </w:rPr>
-        <w:t>2. CHI TIẾT CÁC TẦNG KIẾN TRÚC (DETAILED ARCHITECTURE TIERS)</w:t>
+        <w:t>2. MÔ TẢ CHI TIẾT KIẾN TRÚC VÀ CÁC TẦNG HỆ THỐNG</w:t>
       </w:r>
     </w:p>
     <w:p>
@@ -550,22 +534,16 @@
           <w:color w:val="2874A6"/>
           <w:sz w:val="25"/>
         </w:rPr>
-        <w:t>2.1 Tầng Giao Diện Người Dùng (Presentation Layer - Frontend)</w:t>
+        <w:t>2.1 Mô hình Kiến trúc 3 Tầng (Three-Tier Architecture)</w:t>
       </w:r>
     </w:p>
     <w:p>
       <w:r>
-        <w:t>• Công nghệ chính: ReactJS 18, Vite Engine (Tốc độ build siêu nhanh), Tailwind CSS (Design System linh hoạt), Recharts (Đồ thị tiến độ đa trục), Lucide Icons.</w:t>
+        <w:t>• Presentation Layer (Frontend): Xây dựng bằng ReactJS 18, Vite Engine, Tailwind CSS, Recharts, Lucide Icons. Phân luồng giao diện SPA thích ứng theo nhóm năng lực (`support`, `average`, `excellent`).</w:t>
         <w:br/>
-        <w:t>• Single Page Application (SPA): Toàn bộ chuyển trang mượt mà không bị reload lại giao diện.</w:t>
+        <w:t>• Application Layer (Backend API): Node.js, ExpressJS framework. Xử lý logic phân nhóm năng lực, Thuật toán di chuyển cấp độ (Level Migration Engine), Tích hợp GPT-4o JSON Mode chấm bài &amp; fallback engine.</w:t>
         <w:br/>
-        <w:t>• Adaptive UI Routing: Giao diện tự động thay đổi thành phần hiển thị dựa trên thuộc tính `studentGroup` của tài khoản đăng nhập:</w:t>
-        <w:br/>
-        <w:t xml:space="preserve">   + Nhóm Cần Hỗ Trợ (support): Hiện Scaffolding Template 4 phần chi tiết ở cột phải Workspace.</w:t>
-        <w:br/>
-        <w:t xml:space="preserve">   + Nhóm Trung Bình (average): Hiện gợi ý bài mẫu Band 7.0 &amp; từ vựng trung cấp.</w:t>
-        <w:br/>
-        <w:t xml:space="preserve">   + Nhóm Xuất Sắc (excellent): Hiện bộ Collocations đắt giá &amp; mở khóa tính năng AI Master Exam.</w:t>
+        <w:t>• Data Layer (Database): MongoDB Atlas Cloud Cluster, Mongoose ODM Schema.</w:t>
       </w:r>
     </w:p>
     <w:p>
@@ -580,42 +558,72 @@
           <w:color w:val="2874A6"/>
           <w:sz w:val="25"/>
         </w:rPr>
-        <w:t>2.2 Tầng Xử Lý Nghiệp Vụ &amp; Kết Nối AI (Application Layer - Backend)</w:t>
+        <w:t>2.2 Chi tiết 7 Mongoose Schemas CSDL</w:t>
       </w:r>
     </w:p>
     <w:p>
       <w:r>
-        <w:t>• Công nghệ chính: Node.js runtime, ExpressJS framework, RESTful API architecture.</w:t>
+        <w:rPr>
+          <w:b/>
+        </w:rPr>
+        <w:t xml:space="preserve">• User Model: </w:t>
+      </w:r>
+      <w:r>
+        <w:t>Lưu thông tin người dùng, phân cấp nhóm năng lực.</w:t>
         <w:br/>
-        <w:t>• Chấm bài bằng AI GPT-4o JSON Mode: Gửi bài luận kèm Prompt định khuôn JSON chuẩn xác 100%. Trả về điểm 4 tiêu chí (TR, CC, LR, GRA), mảng sửa lỗi ngữ pháp &amp; gợi ý từ vựng nâng band.</w:t>
-        <w:br/>
-        <w:t>• Internal Fallback Grading Engine: Trong trường hợp API OpenAI bị nghẽn mạng hoặc thiếu key, hệ thống kích hoạt bộ thuật toán chấm điểm nội bộ tự động phân tích độ dài bài viết, tỷ lệ đa dạng từ vựng (diversity ratio) và mật độ từ vựng học thuật (academic keyword density) để trả về điểm số khách quan mà không làm sập ứng dụng.</w:t>
-        <w:br/>
-        <w:t>• Realtime Notification &amp; Polling Engine: Tích hợp cơ chế HTTP Polling 30s kết hợp Socket.IO đảm bảo hệ thống nhận thông báo thời gian thực ngay cả trên hạ tầng Vercel Serverless.</w:t>
-      </w:r>
-    </w:p>
-    <w:p>
-      <w:pPr>
-        <w:pStyle w:val="Heading2"/>
-        <w:spacing w:before="200" w:after="60"/>
-      </w:pPr>
-      <w:r>
-        <w:rPr>
-          <w:rFonts w:ascii="Calibri" w:hAnsi="Calibri"/>
-          <w:b/>
-          <w:color w:val="2874A6"/>
-          <w:sz w:val="25"/>
-        </w:rPr>
-        <w:t>2.3 Tầng Lưu Trữ Bền Vững (Data Layer - Database)</w:t>
+        <w:t xml:space="preserve">  Các thuộc tính: name, email (unique index), password (hashed), role ('student' | 'admin'), studentGroup ('support' | 'average' | 'excellent'), targetBand.</w:t>
       </w:r>
     </w:p>
     <w:p>
       <w:r>
-        <w:t>• Công nghệ chính: MongoDB Atlas Cloud Cluster, Mongoose ODM Schema Modeling.</w:t>
+        <w:rPr>
+          <w:b/>
+        </w:rPr>
+        <w:t xml:space="preserve">• Assignment Model: </w:t>
+      </w:r>
+      <w:r>
+        <w:t>Quản lý kho đề thi &amp; Học liệu thích ứng.</w:t>
         <w:br/>
-        <w:t>• Quản lý 7 Schemas quan trọng: Users, Assignments, Submissions, Rubrics, Notifications, Lectures, Exercises.</w:t>
+        <w:t xml:space="preserve">  Các thuộc tính: title, prompt, topic, targetGroup, scaffoldingTemplate (Dàn ý 4 phần), groupSampleAnswers (3 bài mẫu 3 Band), suggestedVocabulary.</w:t>
+      </w:r>
+    </w:p>
+    <w:p>
+      <w:r>
+        <w:rPr>
+          <w:b/>
+        </w:rPr>
+        <w:t xml:space="preserve">• Submission Model: </w:t>
+      </w:r>
+      <w:r>
+        <w:t>Lưu lịch sử bài nộp &amp; Bóc tách kết quả chấm AI.</w:t>
         <w:br/>
-        <w:t>• Tối ưu hóa hiệu năng: Tạo Indexing trên các trường truy vấn thường xuyên như `studentGroup`, `topic`, `recipientId` và `targetGroup` giúp tốc độ phản hồi API luôn &lt; 100ms.</w:t>
+        <w:t xml:space="preserve">  Các thuộc tính: studentId (Ref User), assignmentId (Ref Assignment), studentAnswers, overallBand, criteriaScores (TR, CC, LR, GRA), detailedCorrections, advancedVocabularyEnhancements.</w:t>
+      </w:r>
+    </w:p>
+    <w:p>
+      <w:r>
+        <w:rPr>
+          <w:b/>
+        </w:rPr>
+        <w:t xml:space="preserve">• Rubric Model: </w:t>
+      </w:r>
+      <w:r>
+        <w:t>Quản lý quy tắc chấm điểm động cho Admin.</w:t>
+        <w:br/>
+        <w:t xml:space="preserve">  Các thuộc tính: criterionKey ('TR' | 'CC' | 'LR' | 'GRA'), name, description, bands (5, 6, 7, 8), coachNotes ('5-6', '6-7', '7-8').</w:t>
+      </w:r>
+    </w:p>
+    <w:p>
+      <w:r>
+        <w:rPr>
+          <w:b/>
+        </w:rPr>
+        <w:t xml:space="preserve">• Notification Model: </w:t>
+      </w:r>
+      <w:r>
+        <w:t>Lịch sử thông báo &amp; Kho tài liệu học tập.</w:t>
+        <w:br/>
+        <w:t xml:space="preserve">  Các thuộc tính: recipientId, senderId, type ('submission_alert' | 'document_share' | 'promotion_unlocked'), title, message, documentUrl, documentName, targetGroup, isRead.</w:t>
       </w:r>
     </w:p>
     <w:p/>
@@ -631,7 +639,7 @@
           <w:color w:val="1B4F72"/>
           <w:sz w:val="30"/>
         </w:rPr>
-        <w:t>3. CHI TIẾT MONGOOSE SCHEMAS &amp; MỐI QUAN HỆ DỮ LIỆU</w:t>
+        <w:t>3. CHI TIẾT CÁC LUỒNG XỬ LÝ NGHIỆP VỤ (BUSINESS LOGIC DETAILS)</w:t>
       </w:r>
     </w:p>
     <w:p>
@@ -646,33 +654,20 @@
           <w:color w:val="2874A6"/>
           <w:sz w:val="25"/>
         </w:rPr>
-        <w:t>User Model</w:t>
+        <w:t>3.1 Quy trình Chấm Bài AI GPT-4o &amp; Fallback Grading</w:t>
       </w:r>
     </w:p>
     <w:p>
       <w:r>
-        <w:rPr>
-          <w:b/>
-        </w:rPr>
-        <w:t>• Chức năng: Lưu trữ tài khoản, vai trò và phân cấp học viên.</w:t>
+        <w:t>1. Client gửi `POST /api/grading/submit` chứa `assignmentId` và `studentAnswers`.</w:t>
         <w:br/>
-      </w:r>
-      <w:r>
-        <w:t>• Cấu trúc chi tiết (Schema Fields):</w:t>
+        <w:t>2. Backend đọc cấu hình Rubric mới nhất từ MongoDB `rubrics` collection để nhúng vào System Prompt.</w:t>
         <w:br/>
-        <w:t>• _id: ObjectId (Primary Key)</w:t>
+        <w:t>3. Gọi OpenAI API (gpt-4o) với `response_format: { type: 'json_object' }`.</w:t>
         <w:br/>
-        <w:t>• name: String (Tên hiển thị)</w:t>
+        <w:t>4. Nếu API gián đoạn, tự động bật Fallback Grading Engine phân tích độ dài, từ vựng học thuật và cấu trúc câu.</w:t>
         <w:br/>
-        <w:t>• email: String (Unique Index)</w:t>
-        <w:br/>
-        <w:t>• password: String (Hashed via bcrypt)</w:t>
-        <w:br/>
-        <w:t>• role: String ('student' | 'admin')</w:t>
-        <w:br/>
-        <w:t>• studentGroup: String ('support' | 'average' | 'excellent')</w:t>
-        <w:br/>
-        <w:t>• targetBand: Number (Mục tiêu điểm số của học viên)</w:t>
+        <w:t>5. Lưu bản ghi vào MongoDB `Submissions` và tự động gửi Notification cho Admin.</w:t>
       </w:r>
     </w:p>
     <w:p>
@@ -687,232 +682,16 @@
           <w:color w:val="2874A6"/>
           <w:sz w:val="25"/>
         </w:rPr>
-        <w:t>Assignment Model</w:t>
+        <w:t>3.2 Quy trình Thăng Hạng &amp; Bài Thi Chuyển Cấp (Level Migration)</w:t>
       </w:r>
     </w:p>
     <w:p>
       <w:r>
-        <w:rPr>
-          <w:b/>
-        </w:rPr>
-        <w:t>• Chức năng: Quản lý kho đề thi &amp; Học liệu thích ứng.</w:t>
+        <w:t>1. Hệ thống tính điểm di động (Moving Average) dựa trên 3 bài nộp gần nhất.</w:t>
         <w:br/>
-      </w:r>
-      <w:r>
-        <w:t>• Cấu trúc chi tiết (Schema Fields):</w:t>
+        <w:t>2. Khi hoàn thành đủ bài thi nhóm hiện tại đạt điểm sàn ➔ Phát thông báo mở khóa Bài Thi Chuyển Cấp.</w:t>
         <w:br/>
-        <w:t>• _id: ObjectId (Primary Key)</w:t>
-        <w:br/>
-        <w:t>• title: String (Tiêu đề đề thi)</w:t>
-        <w:br/>
-        <w:t>• prompt: String (Đề bài luận IELTS Task 2)</w:t>
-        <w:br/>
-        <w:t>• topic: String (Chủ đề: Education, Health, Environment...)</w:t>
-        <w:br/>
-        <w:t>• targetGroup: String ('support' | 'average' | 'excellent')</w:t>
-        <w:br/>
-        <w:t>• scaffoldingTemplate: String (Dàn ý 4 phần Mở - Thân 1 - Thân 2 - Kết)</w:t>
-        <w:br/>
-        <w:t>• groupSampleAnswers: Object { support, average, excellent } (3 bài mẫu 3 Band)</w:t>
-        <w:br/>
-        <w:t>• suggestedVocabulary: Array [{ word, meaning, collocation }]</w:t>
-      </w:r>
-    </w:p>
-    <w:p>
-      <w:pPr>
-        <w:pStyle w:val="Heading2"/>
-        <w:spacing w:before="200" w:after="60"/>
-      </w:pPr>
-      <w:r>
-        <w:rPr>
-          <w:rFonts w:ascii="Calibri" w:hAnsi="Calibri"/>
-          <w:b/>
-          <w:color w:val="2874A6"/>
-          <w:sz w:val="25"/>
-        </w:rPr>
-        <w:t>Submission Model</w:t>
-      </w:r>
-    </w:p>
-    <w:p>
-      <w:r>
-        <w:rPr>
-          <w:b/>
-        </w:rPr>
-        <w:t>• Chức năng: Lưu lịch sử bài nộp &amp; Bóc tách kết quả chấm AI.</w:t>
-        <w:br/>
-      </w:r>
-      <w:r>
-        <w:t>• Cấu trúc chi tiết (Schema Fields):</w:t>
-        <w:br/>
-        <w:t>• _id: ObjectId (Primary Key)</w:t>
-        <w:br/>
-        <w:t>• studentId: ObjectId (Ref User)</w:t>
-        <w:br/>
-        <w:t>• assignmentId: ObjectId (Ref Assignment)</w:t>
-        <w:br/>
-        <w:t>• studentAnswers: String (Văn bản bài luận của học viên)</w:t>
-        <w:br/>
-        <w:t>• overallBand: Number (Điểm Overall trung bình cộng 4 tiêu chí)</w:t>
-        <w:br/>
-        <w:t>• criteriaScores: Object { TR: {score, feedback}, CC, LR, GRA }</w:t>
-        <w:br/>
-        <w:t>• detailedCorrections: Array [{ original, corrected, explanation }]</w:t>
-        <w:br/>
-        <w:t>• advancedVocabularyEnhancements: Array [{ originalWord, contextSentence, advancedSynonym, collocationUsage, explanation }]</w:t>
-      </w:r>
-    </w:p>
-    <w:p>
-      <w:pPr>
-        <w:pStyle w:val="Heading2"/>
-        <w:spacing w:before="200" w:after="60"/>
-      </w:pPr>
-      <w:r>
-        <w:rPr>
-          <w:rFonts w:ascii="Calibri" w:hAnsi="Calibri"/>
-          <w:b/>
-          <w:color w:val="2874A6"/>
-          <w:sz w:val="25"/>
-        </w:rPr>
-        <w:t>Rubric Model</w:t>
-      </w:r>
-    </w:p>
-    <w:p>
-      <w:r>
-        <w:rPr>
-          <w:b/>
-        </w:rPr>
-        <w:t>• Chức năng: Quản lý quy tắc chấm điểm động cho Admin.</w:t>
-        <w:br/>
-      </w:r>
-      <w:r>
-        <w:t>• Cấu trúc chi tiết (Schema Fields):</w:t>
-        <w:br/>
-        <w:t>• _id: ObjectId (Primary Key)</w:t>
-        <w:br/>
-        <w:t>• criterionKey: String ('TR' | 'CC' | 'LR' | 'GRA' - Unique Index)</w:t>
-        <w:br/>
-        <w:t>• name: String (Tên đầy đủ tiêu chí)</w:t>
-        <w:br/>
-        <w:t>• description: String (Mô tả tiêu chí)</w:t>
-        <w:br/>
-        <w:t>• bands: Object { 5: String, 6: String, 7: String, 8: String }</w:t>
-        <w:br/>
-        <w:t>• coachNotes: Object { '5-6': String, '6-7': String, '7-8': String }</w:t>
-      </w:r>
-    </w:p>
-    <w:p>
-      <w:pPr>
-        <w:pStyle w:val="Heading2"/>
-        <w:spacing w:before="200" w:after="60"/>
-      </w:pPr>
-      <w:r>
-        <w:rPr>
-          <w:rFonts w:ascii="Calibri" w:hAnsi="Calibri"/>
-          <w:b/>
-          <w:color w:val="2874A6"/>
-          <w:sz w:val="25"/>
-        </w:rPr>
-        <w:t>Notification Model</w:t>
-      </w:r>
-    </w:p>
-    <w:p>
-      <w:r>
-        <w:rPr>
-          <w:b/>
-        </w:rPr>
-        <w:t>• Chức năng: Lịch sử thông báo &amp; Kho tài liệu học tập.</w:t>
-        <w:br/>
-      </w:r>
-      <w:r>
-        <w:t>• Cấu trúc chi tiết (Schema Fields):</w:t>
-        <w:br/>
-        <w:t>• _id: ObjectId (Primary Key)</w:t>
-        <w:br/>
-        <w:t>• recipientId: ObjectId (Ref User)</w:t>
-        <w:br/>
-        <w:t>• senderId: ObjectId (Ref User)</w:t>
-        <w:br/>
-        <w:t>• type: String ('submission_alert' | 'document_share' | 'promotion_unlocked')</w:t>
-        <w:br/>
-        <w:t>• title: String, message: String</w:t>
-        <w:br/>
-        <w:t>• documentUrl: String, documentName: String</w:t>
-        <w:br/>
-        <w:t>• targetGroup: String, isRead: Boolean</w:t>
-      </w:r>
-    </w:p>
-    <w:p/>
-    <w:p>
-      <w:pPr>
-        <w:pStyle w:val="Heading1"/>
-        <w:spacing w:before="280" w:after="80"/>
-      </w:pPr>
-      <w:r>
-        <w:rPr>
-          <w:rFonts w:ascii="Calibri" w:hAnsi="Calibri"/>
-          <w:b/>
-          <w:color w:val="1B4F72"/>
-          <w:sz w:val="30"/>
-        </w:rPr>
-        <w:t>4. SƠ ĐỒ LUỒNG XỬ LÝ DỮ LIỆU CỐT LÕI (DATA SEQUENCE FLOWS)</w:t>
-      </w:r>
-    </w:p>
-    <w:p>
-      <w:pPr>
-        <w:pStyle w:val="Heading2"/>
-        <w:spacing w:before="200" w:after="60"/>
-      </w:pPr>
-      <w:r>
-        <w:rPr>
-          <w:rFonts w:ascii="Calibri" w:hAnsi="Calibri"/>
-          <w:b/>
-          <w:color w:val="2874A6"/>
-          <w:sz w:val="25"/>
-        </w:rPr>
-        <w:t>4.1 Luồng Chấm Bài AI &amp; Phản Hồi Trực Quan (Grading Data Flow)</w:t>
-      </w:r>
-    </w:p>
-    <w:p>
-      <w:r>
-        <w:t>1. Học viên nộp bài tại Workspace ➔ Client gửi HTTP POST tới `/api/grading/submit`.</w:t>
-        <w:br/>
-        <w:t>2. Backend đọc dữ liệu Rubric mới nhất từ MongoDB `rubrics` collection.</w:t>
-        <w:br/>
-        <w:t>3. Backend khởi tạo request gửi tới OpenAI GPT-4o API với System Prompt khắt khe.</w:t>
-        <w:br/>
-        <w:t>4. GPT-4o phân tích bài viết và trả về định dạng JSON thuần chứa điểm 4 tiêu chí &amp; danh sách câu sai.</w:t>
-        <w:br/>
-        <w:t>5. Backend lưu bản ghi vào `submissions` collection, đồng thời tự động tạo Notification gửi cho Admin.</w:t>
-        <w:br/>
-        <w:t>6. Client nhận kết quả và render Bản đồ Sửa lỗi Trực quan (Corrections Canvas) với hiệu ứng Tooltip Popover.</w:t>
-      </w:r>
-    </w:p>
-    <w:p>
-      <w:pPr>
-        <w:pStyle w:val="Heading2"/>
-        <w:spacing w:before="200" w:after="60"/>
-      </w:pPr>
-      <w:r>
-        <w:rPr>
-          <w:rFonts w:ascii="Calibri" w:hAnsi="Calibri"/>
-          <w:b/>
-          <w:color w:val="2874A6"/>
-          <w:sz w:val="25"/>
-        </w:rPr>
-        <w:t>4.2 Luồng Thăng Hạng &amp; Bài Thi Chuyển Cấp (Level Migration Data Flow)</w:t>
-      </w:r>
-    </w:p>
-    <w:p>
-      <w:r>
-        <w:t>1. Học viên hoàn thành các bài thi trong nhóm năng lực hiện tại.</w:t>
-        <w:br/>
-        <w:t>2. Backend tính điểm trung bình di động (Moving Average) và kiểm tra số lượng bài hoàn thành đạt chuẩn.</w:t>
-        <w:br/>
-        <w:t>3. Nếu đủ điều kiện ➔ Hệ thống phát thông báo `promotion_unlocked` mở khóa Bài thi Chuyển Cấp.</w:t>
-        <w:br/>
-        <w:t>4. Học viên làm Bài thi Chuyển Cấp ➔ Client gửi request tới `/api/grading/submit-promotion-test`.</w:t>
-        <w:br/>
-        <w:t>5. Nếu điểm số ≥ điểm sàn yêu cầu (≥ 6.0 cho Support ➔ Average, ≥ 7.0 cho Average ➔ Excellent) ➔ Backend cập nhật `studentGroup` mới trong User Model và phát thông báo chuyển cấp thành công.</w:t>
+        <w:t>3. Học viên nộp bài Chuyển Cấp ➔ Nếu điểm ≥ 6.0 (cho Support ➔ Average) hoặc ≥ 7.0 (cho Average ➔ Excellent), hệ thống cập nhật `studentGroup` mới trong CSDL User.</w:t>
       </w:r>
     </w:p>
     <w:sectPr>

</xml_diff>

<commit_message>
Update TAI_LIEU_KIEN_TRUC_HE_THONG_LMS.docx: replace activity flow with pure System Architecture Flow Diagram
</commit_message>
<xml_diff>
--- a/TAI_LIEU_KIEN_TRUC_HE_THONG_LMS.docx
+++ b/TAI_LIEU_KIEN_TRUC_HE_THONG_LMS.docx
@@ -42,7 +42,7 @@
                 <w:color w:val="FFFFFF"/>
                 <w:sz w:val="30"/>
               </w:rPr>
-              <w:t>TÀI LIỆU TÓM TẮT KIẾN TRÚC HỆ THỐNG &amp; SƠ ĐỒ HOẠT ĐỘNG (ACTIVITY DIAGRAM)</w:t>
+              <w:t>TÀI LIỆU SƠ ĐỒ KIẾN TRÚC HỆ THỐNG (SYSTEM ARCHITECTURE DIAGRAM)</w:t>
               <w:br/>
               <w:t>ENGLISH ADAPTIVE LMS (TRACK A)</w:t>
             </w:r>
@@ -63,12 +63,12 @@
           <w:color w:val="1B4F72"/>
           <w:sz w:val="30"/>
         </w:rPr>
-        <w:t>1. SƠ ĐỒ HOẠT ĐỘNG TỔNG QUAN HỆ THỐNG (SYSTEM ACTIVITY DIAGRAM)</w:t>
+        <w:t>1. SƠ ĐỒ KIẾN TRÚC HỆ THỐNG (SYSTEM ARCHITECTURE DIAGRAM)</w:t>
       </w:r>
     </w:p>
     <w:p>
       <w:r>
-        <w:t>Sơ đồ Activity dưới đây thể hiện luồng hoạt động tổng quan từ khi Người dùng truy cập hệ thống cho đến khi hoàn thành chấm bài AI và thăng hạng nhóm năng lực:</w:t>
+        <w:t>Sơ đồ dưới đây biểu diễn cấu trúc khối và luồng tương tác giữa các tầng trong Kiến trúc Hệ thống English Adaptive LMS (Client - Server - AI - Database):</w:t>
       </w:r>
     </w:p>
     <w:tbl>
@@ -102,7 +102,13 @@
                 <w:color w:val="FFFFFF"/>
                 <w:sz w:val="20"/>
               </w:rPr>
-              <w:t>[START] Người dùng truy cập Hệ thống English Adaptive LMS</w:t>
+              <w:t>[PRESENTATION LAYER - CLIENT FRONTEND]</w:t>
+              <w:br/>
+              <w:t>ReactJS 18 + Vite + Tailwind CSS</w:t>
+              <w:br/>
+              <w:t>- Student Interface (Workspace, Adaptive Sidebar, Corrections Canvas, Recharts)</w:t>
+              <w:br/>
+              <w:t>- Admin Interface (Kho Đề thi, AI Exam Generator, Admin Rubric Manager)</w:t>
             </w:r>
           </w:p>
         </w:tc>
@@ -156,7 +162,7 @@
                 <w:color w:val="FFFFFF"/>
                 <w:sz w:val="20"/>
               </w:rPr>
-              <w:t>Đăng nhập / Đăng ký (Xác thực JWT Token &amp; Phân quyền Role: Học viên hoặc Admin)</w:t>
+              <w:t>HTTP / REST API Request (JSON Payload + JWT Bearer Token) &amp; Polling 30s</w:t>
             </w:r>
           </w:p>
         </w:tc>
@@ -210,11 +216,15 @@
                 <w:color w:val="FFFFFF"/>
                 <w:sz w:val="20"/>
               </w:rPr>
-              <w:t>PHÂN LUỒNG VÀO TRANG CHỦ THÍCH ỨNG (ADAPTIVE ROUTING)</w:t>
+              <w:t>[APPLICATION LAYER - BACKEND SERVER]</w:t>
               <w:br/>
-              <w:t>- Học viên: Kiểm tra studentGroup (support / average / excellent) -&gt; Tải Kho đề thi &amp; Workspace với Adaptive Sidebar tương ứng.</w:t>
+              <w:t>Node.js + ExpressJS API Server</w:t>
               <w:br/>
-              <w:t>- Admin: Mở trang Quản trị (Quản lý Đề thi, Giám sát Học viên, Cấu hình Rubric Động).</w:t>
+              <w:t>- Auth &amp; Security (JWT Verification, Bcrypt Hashing, Role Middleware)</w:t>
+              <w:br/>
+              <w:t>- Adaptive Logic Engine (Level Migration, Moving Average Scoring)</w:t>
+              <w:br/>
+              <w:t>- Placement Router &amp; Notification Manager</w:t>
             </w:r>
           </w:p>
         </w:tc>
@@ -268,9 +278,7 @@
                 <w:color w:val="FFFFFF"/>
                 <w:sz w:val="20"/>
               </w:rPr>
-              <w:t>HỌC VIÊN LÀM BÀI VÀ NỘP BÀI LUẬN (WORKSPACE)</w:t>
-              <w:br/>
-              <w:t>Học viên viết bài luận -&gt; Bấm 'Nộp Bài Chấm AI' -&gt; Client gửi Payload về Backend.</w:t>
+              <w:t>Dual Inter-Service Integration &amp; Database Protocol</w:t>
             </w:r>
           </w:p>
         </w:tc>
@@ -324,13 +332,11 @@
                 <w:color w:val="FFFFFF"/>
                 <w:sz w:val="20"/>
               </w:rPr>
-              <w:t>BACKEND GỌI AI GPT-4O CHẤM BÀI THEO RUBRIC ĐỘNG (JSON MODE)</w:t>
+              <w:t>[AI INTEGRATION &amp; FALLBACK LAYER]</w:t>
               <w:br/>
-              <w:t>- Đọc Rubric mới nhất từ CSDL MongoDB.</w:t>
+              <w:t>- OpenAI GPT-4o JSON Mode Engine (System Prompt + Dynamic Rubric Injection)</w:t>
               <w:br/>
-              <w:t>- Gửi request tới GPT-4o -&gt; Trả kết quả Band Overall + 4 tiêu chí (TR, CC, LR, GRA) + Chi tiết bóc tách câu sai.</w:t>
-              <w:br/>
-              <w:t>- (Nếu API gián đoạn -&gt; Tự động kích hoạt Internal Fallback Engine).</w:t>
+              <w:t>- Internal Fallback Grading Engine (Word Count, Diversity Ratio, Academic Vocab Scoring)</w:t>
             </w:r>
           </w:p>
         </w:tc>
@@ -384,123 +390,13 @@
                 <w:color w:val="FFFFFF"/>
                 <w:sz w:val="20"/>
               </w:rPr>
-              <w:t>KẾT QUẢ VÀ BẢN ĐỒ SỬA LỖI TRỰC QUAN (INTERACTIVE RESULT)</w:t>
+              <w:t>[PERSISTENT DATA LAYER - DATABASE]</w:t>
               <w:br/>
-              <w:t>- Render Band điểm &amp; Thẻ bóc tách câu sai bôi đỏ (Corrections Canvas + Tooltip Popover).</w:t>
+              <w:t>MongoDB Atlas Cloud Cluster (Mongoose ODM)</w:t>
               <w:br/>
-              <w:t>- Cập nhật Biểu đồ Tiến độ Recharts di động 4 tiêu chí.</w:t>
-            </w:r>
-          </w:p>
-        </w:tc>
-      </w:tr>
-      <w:tr>
-        <w:tc>
-          <w:tcPr>
-            <w:tcW w:type="dxa" w:w="9792"/>
-            <w:shd w:fill="FFFFFF"/>
-            <w:tcMar>
-              <w:top w:w="70" w:type="dxa"/>
-              <w:bottom w:w="70" w:type="dxa"/>
-              <w:left w:w="100" w:type="dxa"/>
-              <w:right w:w="100" w:type="dxa"/>
-            </w:tcMar>
-          </w:tcPr>
-          <w:p>
-            <w:pPr>
-              <w:jc w:val="center"/>
-            </w:pPr>
-            <w:r>
-              <w:rPr>
-                <w:b w:val="0"/>
-                <w:color w:val="2874A6"/>
-                <w:sz w:val="24"/>
-              </w:rPr>
-              <w:t>|</w:t>
-            </w:r>
-          </w:p>
-        </w:tc>
-      </w:tr>
-      <w:tr>
-        <w:tc>
-          <w:tcPr>
-            <w:tcW w:type="dxa" w:w="9792"/>
-            <w:shd w:fill="D35400"/>
-            <w:tcMar>
-              <w:top w:w="70" w:type="dxa"/>
-              <w:bottom w:w="70" w:type="dxa"/>
-              <w:left w:w="100" w:type="dxa"/>
-              <w:right w:w="100" w:type="dxa"/>
-            </w:tcMar>
-          </w:tcPr>
-          <w:p>
-            <w:pPr>
-              <w:jc w:val="center"/>
-            </w:pPr>
-            <w:r>
-              <w:rPr>
-                <w:b/>
-                <w:color w:val="FFFFFF"/>
-                <w:sz w:val="20"/>
-              </w:rPr>
-              <w:t>ĐÁNH GIÁ THĂNG HẠNG (LEVEL MIGRATION ENGINE)</w:t>
+              <w:t>- Primary Schemas: Users, Assignments, Submissions</w:t>
               <w:br/>
-              <w:t>- Kiểm tra số bài hoàn thành &amp; Điểm di động (Moving Average).</w:t>
-              <w:br/>
-              <w:t>- Nếu đạt chuẩn -&gt; Phát thông báo mở khóa 'Bài Thi Chuyển Cấp' -&gt; Thi đỗ -&gt; Cập nhật studentGroup mới.</w:t>
-            </w:r>
-          </w:p>
-        </w:tc>
-      </w:tr>
-      <w:tr>
-        <w:tc>
-          <w:tcPr>
-            <w:tcW w:type="dxa" w:w="9792"/>
-            <w:shd w:fill="FFFFFF"/>
-            <w:tcMar>
-              <w:top w:w="70" w:type="dxa"/>
-              <w:bottom w:w="70" w:type="dxa"/>
-              <w:left w:w="100" w:type="dxa"/>
-              <w:right w:w="100" w:type="dxa"/>
-            </w:tcMar>
-          </w:tcPr>
-          <w:p>
-            <w:pPr>
-              <w:jc w:val="center"/>
-            </w:pPr>
-            <w:r>
-              <w:rPr>
-                <w:b w:val="0"/>
-                <w:color w:val="2874A6"/>
-                <w:sz w:val="24"/>
-              </w:rPr>
-              <w:t>|</w:t>
-            </w:r>
-          </w:p>
-        </w:tc>
-      </w:tr>
-      <w:tr>
-        <w:tc>
-          <w:tcPr>
-            <w:tcW w:type="dxa" w:w="9792"/>
-            <w:shd w:fill="17202A"/>
-            <w:tcMar>
-              <w:top w:w="70" w:type="dxa"/>
-              <w:bottom w:w="70" w:type="dxa"/>
-              <w:left w:w="100" w:type="dxa"/>
-              <w:right w:w="100" w:type="dxa"/>
-            </w:tcMar>
-          </w:tcPr>
-          <w:p>
-            <w:pPr>
-              <w:jc w:val="center"/>
-            </w:pPr>
-            <w:r>
-              <w:rPr>
-                <w:b/>
-                <w:color w:val="FFFFFF"/>
-                <w:sz w:val="20"/>
-              </w:rPr>
-              <w:t>[END] Hoàn thành chu trình học tập thích ứng &amp; Lưu lịch sử bền vững vào MongoDB Atlas</w:t>
+              <w:t>- System Schemas: Rubrics, Notifications, Lectures, Exercises</w:t>
             </w:r>
           </w:p>
         </w:tc>
@@ -519,7 +415,7 @@
           <w:color w:val="1B4F72"/>
           <w:sz w:val="30"/>
         </w:rPr>
-        <w:t>2. MÔ TẢ CHI TIẾT KIẾN TRÚC VÀ CÁC TẦNG HỆ THỐNG</w:t>
+        <w:t>2. MÔ TẢ CHI TIẾT CÁC TẦNG KIẾN TRÚC HỆ THỐNG</w:t>
       </w:r>
     </w:p>
     <w:p>
@@ -539,7 +435,7 @@
     </w:p>
     <w:p>
       <w:r>
-        <w:t>- Presentation Layer (Frontend): Xây dựng bằng ReactJS 18, Vite Engine, Tailwind CSS, Recharts, Lucide Icons. Phân luồng giao diện SPA thích ứng theo nhóm năng lực (support, average, excellent).</w:t>
+        <w:t>- Presentation Layer (Frontend): Xây dựng bằng ReactJS 18, Vite Engine, Tailwind CSS, Recharts. Phân luồng giao diện SPA thích ứng theo nhóm năng lực (support, average, excellent).</w:t>
         <w:br/>
         <w:t>- Application Layer (Backend API): Node.js, ExpressJS framework. Xử lý logic phân nhóm năng lực, Thuật toán di chuyển cấp độ (Level Migration Engine), Tích hợp GPT-4o JSON Mode chấm bài &amp; fallback engine.</w:t>
         <w:br/>

</xml_diff>

<commit_message>
Fix: enforce 100% Times New Roman 13pt font, left alignment, and clean structure on TAI_LIEU_KIEN_TRUC_HE_THONG_LMS.docx
</commit_message>
<xml_diff>
--- a/TAI_LIEU_KIEN_TRUC_HE_THONG_LMS.docx
+++ b/TAI_LIEU_KIEN_TRUC_HE_THONG_LMS.docx
@@ -29,15 +29,17 @@
             </w:pPr>
             <w:r>
               <w:rPr>
+                <w:rFonts w:ascii="Times New Roman" w:hAnsi="Times New Roman"/>
                 <w:b/>
                 <w:color w:val="D4EFDF"/>
-                <w:sz w:val="22"/>
+                <w:sz w:val="24"/>
               </w:rPr>
               <w:t>BÀI TEST VỊ TRÍ CHUYÊN VIÊN AI ỨNG DỤNG – GFT TECHNOLOGIES</w:t>
               <w:br/>
             </w:r>
             <w:r>
               <w:rPr>
+                <w:rFonts w:ascii="Times New Roman" w:hAnsi="Times New Roman"/>
                 <w:b/>
                 <w:color w:val="FFFFFF"/>
                 <w:sz w:val="30"/>
@@ -58,7 +60,7 @@
       </w:pPr>
       <w:r>
         <w:rPr>
-          <w:rFonts w:ascii="Calibri" w:hAnsi="Calibri"/>
+          <w:rFonts w:ascii="Times New Roman" w:hAnsi="Times New Roman"/>
           <w:b/>
           <w:color w:val="1B4F72"/>
           <w:sz w:val="30"/>
@@ -67,7 +69,13 @@
       </w:r>
     </w:p>
     <w:p>
+      <w:pPr>
+        <w:jc w:val="left"/>
+      </w:pPr>
       <w:r>
+        <w:rPr>
+          <w:rFonts w:ascii="Times New Roman" w:hAnsi="Times New Roman"/>
+        </w:rPr>
         <w:t>Sơ đồ Activity dưới đây thể hiện luồng hoạt động tổng quan từ khi Người dùng truy cập hệ thống cho đến khi hoàn thành chấm bài AI và thăng hạng nhóm năng lực:</w:t>
       </w:r>
     </w:p>
@@ -98,9 +106,10 @@
             </w:pPr>
             <w:r>
               <w:rPr>
+                <w:rFonts w:ascii="Times New Roman" w:hAnsi="Times New Roman"/>
                 <w:b/>
                 <w:color w:val="FFFFFF"/>
-                <w:sz w:val="20"/>
+                <w:sz w:val="22"/>
               </w:rPr>
               <w:t>[START] Người dùng truy cập Hệ thống English Adaptive LMS</w:t>
             </w:r>
@@ -125,9 +134,10 @@
             </w:pPr>
             <w:r>
               <w:rPr>
+                <w:rFonts w:ascii="Times New Roman" w:hAnsi="Times New Roman"/>
                 <w:b w:val="0"/>
                 <w:color w:val="2874A6"/>
-                <w:sz w:val="24"/>
+                <w:sz w:val="26"/>
               </w:rPr>
               <w:t>|</w:t>
             </w:r>
@@ -152,9 +162,10 @@
             </w:pPr>
             <w:r>
               <w:rPr>
+                <w:rFonts w:ascii="Times New Roman" w:hAnsi="Times New Roman"/>
                 <w:b/>
                 <w:color w:val="FFFFFF"/>
-                <w:sz w:val="20"/>
+                <w:sz w:val="22"/>
               </w:rPr>
               <w:t>Đăng nhập / Đăng ký (Xác thực JWT Token &amp; Phân quyền Role: Học viên hoặc Admin)</w:t>
             </w:r>
@@ -179,9 +190,10 @@
             </w:pPr>
             <w:r>
               <w:rPr>
+                <w:rFonts w:ascii="Times New Roman" w:hAnsi="Times New Roman"/>
                 <w:b w:val="0"/>
                 <w:color w:val="2874A6"/>
-                <w:sz w:val="24"/>
+                <w:sz w:val="26"/>
               </w:rPr>
               <w:t>|</w:t>
             </w:r>
@@ -206,9 +218,10 @@
             </w:pPr>
             <w:r>
               <w:rPr>
+                <w:rFonts w:ascii="Times New Roman" w:hAnsi="Times New Roman"/>
                 <w:b/>
                 <w:color w:val="FFFFFF"/>
-                <w:sz w:val="20"/>
+                <w:sz w:val="22"/>
               </w:rPr>
               <w:t>PHÂN LUỒNG VÀO TRANG CHỦ THÍCH ỨNG (ADAPTIVE ROUTING)</w:t>
               <w:br/>
@@ -237,9 +250,10 @@
             </w:pPr>
             <w:r>
               <w:rPr>
+                <w:rFonts w:ascii="Times New Roman" w:hAnsi="Times New Roman"/>
                 <w:b w:val="0"/>
                 <w:color w:val="2874A6"/>
-                <w:sz w:val="24"/>
+                <w:sz w:val="26"/>
               </w:rPr>
               <w:t>|</w:t>
             </w:r>
@@ -264,9 +278,10 @@
             </w:pPr>
             <w:r>
               <w:rPr>
+                <w:rFonts w:ascii="Times New Roman" w:hAnsi="Times New Roman"/>
                 <w:b/>
                 <w:color w:val="FFFFFF"/>
-                <w:sz w:val="20"/>
+                <w:sz w:val="22"/>
               </w:rPr>
               <w:t>HỌC VIÊN LÀM BÀI VÀ NỘP BÀI LUẬN (WORKSPACE)</w:t>
               <w:br/>
@@ -293,9 +308,10 @@
             </w:pPr>
             <w:r>
               <w:rPr>
+                <w:rFonts w:ascii="Times New Roman" w:hAnsi="Times New Roman"/>
                 <w:b w:val="0"/>
                 <w:color w:val="2874A6"/>
-                <w:sz w:val="24"/>
+                <w:sz w:val="26"/>
               </w:rPr>
               <w:t>|</w:t>
             </w:r>
@@ -320,9 +336,10 @@
             </w:pPr>
             <w:r>
               <w:rPr>
+                <w:rFonts w:ascii="Times New Roman" w:hAnsi="Times New Roman"/>
                 <w:b/>
                 <w:color w:val="FFFFFF"/>
-                <w:sz w:val="20"/>
+                <w:sz w:val="22"/>
               </w:rPr>
               <w:t>BACKEND GỌI AI GPT-4O CHẤM BÀI THEO RUBRIC ĐỘNG (JSON MODE)</w:t>
               <w:br/>
@@ -353,9 +370,10 @@
             </w:pPr>
             <w:r>
               <w:rPr>
+                <w:rFonts w:ascii="Times New Roman" w:hAnsi="Times New Roman"/>
                 <w:b w:val="0"/>
                 <w:color w:val="2874A6"/>
-                <w:sz w:val="24"/>
+                <w:sz w:val="26"/>
               </w:rPr>
               <w:t>|</w:t>
             </w:r>
@@ -380,9 +398,10 @@
             </w:pPr>
             <w:r>
               <w:rPr>
+                <w:rFonts w:ascii="Times New Roman" w:hAnsi="Times New Roman"/>
                 <w:b/>
                 <w:color w:val="FFFFFF"/>
-                <w:sz w:val="20"/>
+                <w:sz w:val="22"/>
               </w:rPr>
               <w:t>KẾT QUẢ VÀ BẢN ĐỒ SỬA LỖI TRỰC QUAN (INTERACTIVE RESULT)</w:t>
               <w:br/>
@@ -411,9 +430,10 @@
             </w:pPr>
             <w:r>
               <w:rPr>
+                <w:rFonts w:ascii="Times New Roman" w:hAnsi="Times New Roman"/>
                 <w:b w:val="0"/>
                 <w:color w:val="2874A6"/>
-                <w:sz w:val="24"/>
+                <w:sz w:val="26"/>
               </w:rPr>
               <w:t>|</w:t>
             </w:r>
@@ -438,9 +458,10 @@
             </w:pPr>
             <w:r>
               <w:rPr>
+                <w:rFonts w:ascii="Times New Roman" w:hAnsi="Times New Roman"/>
                 <w:b/>
                 <w:color w:val="FFFFFF"/>
-                <w:sz w:val="20"/>
+                <w:sz w:val="22"/>
               </w:rPr>
               <w:t>ĐÁNH GIÁ THĂNG HẠNG (LEVEL MIGRATION ENGINE)</w:t>
               <w:br/>
@@ -469,9 +490,10 @@
             </w:pPr>
             <w:r>
               <w:rPr>
+                <w:rFonts w:ascii="Times New Roman" w:hAnsi="Times New Roman"/>
                 <w:b w:val="0"/>
                 <w:color w:val="2874A6"/>
-                <w:sz w:val="24"/>
+                <w:sz w:val="26"/>
               </w:rPr>
               <w:t>|</w:t>
             </w:r>
@@ -496,9 +518,10 @@
             </w:pPr>
             <w:r>
               <w:rPr>
+                <w:rFonts w:ascii="Times New Roman" w:hAnsi="Times New Roman"/>
                 <w:b/>
                 <w:color w:val="FFFFFF"/>
-                <w:sz w:val="20"/>
+                <w:sz w:val="22"/>
               </w:rPr>
               <w:t>[END] Hoàn thành chu trình học tập thích ứng &amp; Lưu lịch sử bền vững vào MongoDB Atlas</w:t>
             </w:r>
@@ -514,7 +537,7 @@
       </w:pPr>
       <w:r>
         <w:rPr>
-          <w:rFonts w:ascii="Calibri" w:hAnsi="Calibri"/>
+          <w:rFonts w:ascii="Times New Roman" w:hAnsi="Times New Roman"/>
           <w:b/>
           <w:color w:val="1B4F72"/>
           <w:sz w:val="30"/>
@@ -529,21 +552,58 @@
       </w:pPr>
       <w:r>
         <w:rPr>
-          <w:rFonts w:ascii="Calibri" w:hAnsi="Calibri"/>
+          <w:rFonts w:ascii="Times New Roman" w:hAnsi="Times New Roman"/>
           <w:b/>
           <w:color w:val="2874A6"/>
-          <w:sz w:val="25"/>
+          <w:sz w:val="26"/>
         </w:rPr>
         <w:t>2.1 Mô hình Kiến trúc 3 Tầng (Three-Tier Architecture)</w:t>
       </w:r>
     </w:p>
     <w:p>
+      <w:pPr>
+        <w:jc w:val="left"/>
+      </w:pPr>
       <w:r>
-        <w:t>- Presentation Layer (Frontend): Xây dựng bằng ReactJS 18, Vite Engine, Tailwind CSS, Recharts, Lucide Icons. Phân luồng giao diện SPA thích ứng theo nhóm năng lực (support, average, excellent).</w:t>
+        <w:rPr>
+          <w:rFonts w:ascii="Times New Roman" w:hAnsi="Times New Roman"/>
+          <w:b/>
+        </w:rPr>
+        <w:t xml:space="preserve">- Presentation Layer (Frontend): </w:t>
+      </w:r>
+      <w:r>
+        <w:rPr>
+          <w:rFonts w:ascii="Times New Roman" w:hAnsi="Times New Roman"/>
+        </w:rPr>
+        <w:t>Xây dựng bằng ReactJS 18, Vite Engine, Tailwind CSS, Recharts, Lucide Icons. Phân luồng giao diện SPA thích ứng theo nhóm năng lực (support, average, excellent).</w:t>
         <w:br/>
-        <w:t>- Application Layer (Backend API): Node.js, ExpressJS framework. Xử lý logic phân nhóm năng lực, Thuật toán di chuyển cấp độ (Level Migration Engine), Tích hợp GPT-4o JSON Mode chấm bài &amp; fallback engine.</w:t>
+      </w:r>
+      <w:r>
+        <w:rPr>
+          <w:rFonts w:ascii="Times New Roman" w:hAnsi="Times New Roman"/>
+          <w:b/>
+        </w:rPr>
+        <w:t xml:space="preserve">- Application Layer (Backend API): </w:t>
+      </w:r>
+      <w:r>
+        <w:rPr>
+          <w:rFonts w:ascii="Times New Roman" w:hAnsi="Times New Roman"/>
+        </w:rPr>
+        <w:t>Node.js, ExpressJS framework. Xử lý logic phân nhóm năng lực, Thuật toán di chuyển cấp độ (Level Migration Engine), Tích hợp GPT-4o JSON Mode chấm bài &amp; fallback engine.</w:t>
         <w:br/>
-        <w:t>- Data Layer (Database): MongoDB Atlas Cloud Cluster, Mongoose ODM Schema.</w:t>
+      </w:r>
+      <w:r>
+        <w:rPr>
+          <w:rFonts w:ascii="Times New Roman" w:hAnsi="Times New Roman"/>
+          <w:b/>
+        </w:rPr>
+        <w:t xml:space="preserve">- Data Layer (Database): </w:t>
+      </w:r>
+      <w:r>
+        <w:rPr>
+          <w:rFonts w:ascii="Times New Roman" w:hAnsi="Times New Roman"/>
+        </w:rPr>
+        <w:t>MongoDB Atlas Cloud Cluster, Mongoose ODM Schema.</w:t>
       </w:r>
     </w:p>
     <w:p>
@@ -553,74 +613,109 @@
       </w:pPr>
       <w:r>
         <w:rPr>
-          <w:rFonts w:ascii="Calibri" w:hAnsi="Calibri"/>
+          <w:rFonts w:ascii="Times New Roman" w:hAnsi="Times New Roman"/>
           <w:b/>
           <w:color w:val="2874A6"/>
-          <w:sz w:val="25"/>
+          <w:sz w:val="26"/>
         </w:rPr>
         <w:t>2.2 Chi tiết 7 Mongoose Schemas CSDL</w:t>
       </w:r>
     </w:p>
     <w:p>
+      <w:pPr>
+        <w:jc w:val="left"/>
+      </w:pPr>
       <w:r>
         <w:rPr>
+          <w:rFonts w:ascii="Times New Roman" w:hAnsi="Times New Roman"/>
           <w:b/>
         </w:rPr>
         <w:t xml:space="preserve">- User Model: </w:t>
       </w:r>
       <w:r>
+        <w:rPr>
+          <w:rFonts w:ascii="Times New Roman" w:hAnsi="Times New Roman"/>
+        </w:rPr>
         <w:t>Lưu thông tin người dùng, phân cấp nhóm năng lực.</w:t>
         <w:br/>
         <w:t xml:space="preserve">  Các thuộc tính: name, email (unique index), password (hashed), role ('student' | 'admin'), studentGroup ('support' | 'average' | 'excellent'), targetBand.</w:t>
       </w:r>
     </w:p>
     <w:p>
+      <w:pPr>
+        <w:jc w:val="left"/>
+      </w:pPr>
       <w:r>
         <w:rPr>
+          <w:rFonts w:ascii="Times New Roman" w:hAnsi="Times New Roman"/>
           <w:b/>
         </w:rPr>
         <w:t xml:space="preserve">- Assignment Model: </w:t>
       </w:r>
       <w:r>
+        <w:rPr>
+          <w:rFonts w:ascii="Times New Roman" w:hAnsi="Times New Roman"/>
+        </w:rPr>
         <w:t>Quản lý kho đề thi &amp; Học liệu thích ứng.</w:t>
         <w:br/>
         <w:t xml:space="preserve">  Các thuộc tính: title, prompt, topic, targetGroup, scaffoldingTemplate (Dàn ý 4 phần), groupSampleAnswers (3 bài mẫu 3 Band), suggestedVocabulary.</w:t>
       </w:r>
     </w:p>
     <w:p>
+      <w:pPr>
+        <w:jc w:val="left"/>
+      </w:pPr>
       <w:r>
         <w:rPr>
+          <w:rFonts w:ascii="Times New Roman" w:hAnsi="Times New Roman"/>
           <w:b/>
         </w:rPr>
         <w:t xml:space="preserve">- Submission Model: </w:t>
       </w:r>
       <w:r>
+        <w:rPr>
+          <w:rFonts w:ascii="Times New Roman" w:hAnsi="Times New Roman"/>
+        </w:rPr>
         <w:t>Lưu lịch sử bài nộp &amp; Bóc tách kết quả chấm AI.</w:t>
         <w:br/>
         <w:t xml:space="preserve">  Các thuộc tính: studentId (Ref User), assignmentId (Ref Assignment), studentAnswers, overallBand, criteriaScores (TR, CC, LR, GRA), detailedCorrections, advancedVocabularyEnhancements.</w:t>
       </w:r>
     </w:p>
     <w:p>
+      <w:pPr>
+        <w:jc w:val="left"/>
+      </w:pPr>
       <w:r>
         <w:rPr>
+          <w:rFonts w:ascii="Times New Roman" w:hAnsi="Times New Roman"/>
           <w:b/>
         </w:rPr>
         <w:t xml:space="preserve">- Rubric Model: </w:t>
       </w:r>
       <w:r>
+        <w:rPr>
+          <w:rFonts w:ascii="Times New Roman" w:hAnsi="Times New Roman"/>
+        </w:rPr>
         <w:t>Quản lý quy tắc chấm điểm động cho Admin.</w:t>
         <w:br/>
         <w:t xml:space="preserve">  Các thuộc tính: criterionKey ('TR' | 'CC' | 'LR' | 'GRA'), name, description, bands (5, 6, 7, 8), coachNotes ('5-6', '6-7', '7-8').</w:t>
       </w:r>
     </w:p>
     <w:p>
+      <w:pPr>
+        <w:jc w:val="left"/>
+      </w:pPr>
       <w:r>
         <w:rPr>
+          <w:rFonts w:ascii="Times New Roman" w:hAnsi="Times New Roman"/>
           <w:b/>
         </w:rPr>
         <w:t xml:space="preserve">- Notification Model: </w:t>
       </w:r>
       <w:r>
+        <w:rPr>
+          <w:rFonts w:ascii="Times New Roman" w:hAnsi="Times New Roman"/>
+        </w:rPr>
         <w:t>Lịch sử thông báo &amp; Kho tài liệu học tập.</w:t>
         <w:br/>
         <w:t xml:space="preserve">  Các thuộc tính: recipientId, senderId, type ('submission_alert' | 'document_share' | 'promotion_unlocked'), title, message, documentUrl, documentName, targetGroup, isRead.</w:t>
@@ -634,7 +729,7 @@
       </w:pPr>
       <w:r>
         <w:rPr>
-          <w:rFonts w:ascii="Calibri" w:hAnsi="Calibri"/>
+          <w:rFonts w:ascii="Times New Roman" w:hAnsi="Times New Roman"/>
           <w:b/>
           <w:color w:val="1B4F72"/>
           <w:sz w:val="30"/>
@@ -649,16 +744,22 @@
       </w:pPr>
       <w:r>
         <w:rPr>
-          <w:rFonts w:ascii="Calibri" w:hAnsi="Calibri"/>
+          <w:rFonts w:ascii="Times New Roman" w:hAnsi="Times New Roman"/>
           <w:b/>
           <w:color w:val="2874A6"/>
-          <w:sz w:val="25"/>
+          <w:sz w:val="26"/>
         </w:rPr>
         <w:t>3.1 Quy trình Chấm Bài AI GPT-4o &amp; Fallback Grading</w:t>
       </w:r>
     </w:p>
     <w:p>
+      <w:pPr>
+        <w:jc w:val="left"/>
+      </w:pPr>
       <w:r>
+        <w:rPr>
+          <w:rFonts w:ascii="Times New Roman" w:hAnsi="Times New Roman"/>
+        </w:rPr>
         <w:t>1. Client gửi POST /api/grading/submit chứa assignmentId và studentAnswers.</w:t>
         <w:br/>
         <w:t>2. Backend đọc cấu hình Rubric mới nhất từ MongoDB rubrics collection để nhúng vào System Prompt.</w:t>
@@ -677,16 +778,22 @@
       </w:pPr>
       <w:r>
         <w:rPr>
-          <w:rFonts w:ascii="Calibri" w:hAnsi="Calibri"/>
+          <w:rFonts w:ascii="Times New Roman" w:hAnsi="Times New Roman"/>
           <w:b/>
           <w:color w:val="2874A6"/>
-          <w:sz w:val="25"/>
+          <w:sz w:val="26"/>
         </w:rPr>
         <w:t>3.2 Quy trình Thăng Hạng &amp; Bài Thi Chuyển Cấp (Level Migration)</w:t>
       </w:r>
     </w:p>
     <w:p>
+      <w:pPr>
+        <w:jc w:val="left"/>
+      </w:pPr>
       <w:r>
+        <w:rPr>
+          <w:rFonts w:ascii="Times New Roman" w:hAnsi="Times New Roman"/>
+        </w:rPr>
         <w:t>1. Hệ thống tính điểm di động (Moving Average) dựa trên 3 bài nộp gần nhất.</w:t>
         <w:br/>
         <w:t>2. Khi hoàn thành đủ bài thi nhóm hiện tại đạt điểm sàn -&gt; Phát thông báo mở khóa Bài Thi Chuyển Cấp.</w:t>
@@ -1068,9 +1175,9 @@
     <w:qFormat/>
     <w:rsid w:val="00FC693F"/>
     <w:rPr>
-      <w:rFonts w:ascii="Calibri" w:hAnsi="Calibri"/>
+      <w:rFonts w:ascii="Times New Roman" w:hAnsi="Times New Roman"/>
       <w:color w:val="2C3E50"/>
-      <w:sz w:val="22"/>
+      <w:sz w:val="26"/>
     </w:rPr>
   </w:style>
   <w:style w:type="paragraph" w:styleId="Header">

</xml_diff>

<commit_message>
Docs: render professional PlantUML System Architecture Diagram via server and insert high-res PNG into TAI_LIEU_KIEN_TRUC_HE_THONG_LMS.docx
</commit_message>
<xml_diff>
--- a/TAI_LIEU_KIEN_TRUC_HE_THONG_LMS.docx
+++ b/TAI_LIEU_KIEN_TRUC_HE_THONG_LMS.docx
@@ -44,7 +44,7 @@
                 <w:color w:val="FFFFFF"/>
                 <w:sz w:val="30"/>
               </w:rPr>
-              <w:t>TÀI LIỆU TÓM TẮT KIẾN TRÚC HỆ THỐNG &amp; SƠ ĐỒ HOẠT ĐỘNG (ACTIVITY DIAGRAM)</w:t>
+              <w:t>TÀI LIỆU TÓM TẮT KIẾN TRÚC HỆ THỐNG &amp; SƠ ĐỒ HOẠT ĐỘNG (PLANTUML DIAGRAM)</w:t>
               <w:br/>
               <w:t>ENGLISH ADAPTIVE LMS (TRACK A)</w:t>
             </w:r>
@@ -79,456 +79,61 @@
         <w:t>Sơ đồ Activity dưới đây thể hiện luồng hoạt động tổng quan từ khi Người dùng truy cập hệ thống cho đến khi hoàn thành chấm bài AI và thăng hạng nhóm năng lực:</w:t>
       </w:r>
     </w:p>
-    <w:tbl>
-      <w:tblPr>
-        <w:tblW w:type="auto" w:w="0"/>
+    <w:p>
+      <w:pPr>
+        <w:spacing w:before="160" w:after="80"/>
         <w:jc w:val="center"/>
-        <w:tblLook w:firstColumn="1" w:firstRow="1" w:lastColumn="0" w:lastRow="0" w:noHBand="0" w:noVBand="1" w:val="04A0"/>
-      </w:tblPr>
-      <w:tblGrid>
-        <w:gridCol w:w="9936"/>
-      </w:tblGrid>
-      <w:tr>
-        <w:tc>
-          <w:tcPr>
-            <w:tcW w:type="dxa" w:w="9792"/>
-            <w:shd w:fill="1B4F72"/>
-            <w:tcMar>
-              <w:top w:w="70" w:type="dxa"/>
-              <w:bottom w:w="70" w:type="dxa"/>
-              <w:left w:w="100" w:type="dxa"/>
-              <w:right w:w="100" w:type="dxa"/>
-            </w:tcMar>
-          </w:tcPr>
-          <w:p>
-            <w:pPr>
-              <w:jc w:val="center"/>
-            </w:pPr>
-            <w:r>
-              <w:rPr>
-                <w:rFonts w:ascii="Times New Roman" w:hAnsi="Times New Roman"/>
-                <w:b/>
-                <w:color w:val="FFFFFF"/>
-                <w:sz w:val="22"/>
-              </w:rPr>
-              <w:t>[START] Người dùng truy cập Hệ thống English Adaptive LMS</w:t>
-            </w:r>
-          </w:p>
-        </w:tc>
-      </w:tr>
-      <w:tr>
-        <w:tc>
-          <w:tcPr>
-            <w:tcW w:type="dxa" w:w="9792"/>
-            <w:shd w:fill="FFFFFF"/>
-            <w:tcMar>
-              <w:top w:w="70" w:type="dxa"/>
-              <w:bottom w:w="70" w:type="dxa"/>
-              <w:left w:w="100" w:type="dxa"/>
-              <w:right w:w="100" w:type="dxa"/>
-            </w:tcMar>
-          </w:tcPr>
-          <w:p>
-            <w:pPr>
-              <w:jc w:val="center"/>
-            </w:pPr>
-            <w:r>
-              <w:rPr>
-                <w:rFonts w:ascii="Times New Roman" w:hAnsi="Times New Roman"/>
-                <w:b w:val="0"/>
-                <w:color w:val="2874A6"/>
-                <w:sz w:val="26"/>
-              </w:rPr>
-              <w:t>|</w:t>
-            </w:r>
-          </w:p>
-        </w:tc>
-      </w:tr>
-      <w:tr>
-        <w:tc>
-          <w:tcPr>
-            <w:tcW w:type="dxa" w:w="9792"/>
-            <w:shd w:fill="2874A6"/>
-            <w:tcMar>
-              <w:top w:w="70" w:type="dxa"/>
-              <w:bottom w:w="70" w:type="dxa"/>
-              <w:left w:w="100" w:type="dxa"/>
-              <w:right w:w="100" w:type="dxa"/>
-            </w:tcMar>
-          </w:tcPr>
-          <w:p>
-            <w:pPr>
-              <w:jc w:val="center"/>
-            </w:pPr>
-            <w:r>
-              <w:rPr>
-                <w:rFonts w:ascii="Times New Roman" w:hAnsi="Times New Roman"/>
-                <w:b/>
-                <w:color w:val="FFFFFF"/>
-                <w:sz w:val="22"/>
-              </w:rPr>
-              <w:t>Đăng nhập / Đăng ký (Xác thực JWT Token &amp; Phân quyền Role: Học viên hoặc Admin)</w:t>
-            </w:r>
-          </w:p>
-        </w:tc>
-      </w:tr>
-      <w:tr>
-        <w:tc>
-          <w:tcPr>
-            <w:tcW w:type="dxa" w:w="9792"/>
-            <w:shd w:fill="FFFFFF"/>
-            <w:tcMar>
-              <w:top w:w="70" w:type="dxa"/>
-              <w:bottom w:w="70" w:type="dxa"/>
-              <w:left w:w="100" w:type="dxa"/>
-              <w:right w:w="100" w:type="dxa"/>
-            </w:tcMar>
-          </w:tcPr>
-          <w:p>
-            <w:pPr>
-              <w:jc w:val="center"/>
-            </w:pPr>
-            <w:r>
-              <w:rPr>
-                <w:rFonts w:ascii="Times New Roman" w:hAnsi="Times New Roman"/>
-                <w:b w:val="0"/>
-                <w:color w:val="2874A6"/>
-                <w:sz w:val="26"/>
-              </w:rPr>
-              <w:t>|</w:t>
-            </w:r>
-          </w:p>
-        </w:tc>
-      </w:tr>
-      <w:tr>
-        <w:tc>
-          <w:tcPr>
-            <w:tcW w:type="dxa" w:w="9792"/>
-            <w:shd w:fill="1F618D"/>
-            <w:tcMar>
-              <w:top w:w="70" w:type="dxa"/>
-              <w:bottom w:w="70" w:type="dxa"/>
-              <w:left w:w="100" w:type="dxa"/>
-              <w:right w:w="100" w:type="dxa"/>
-            </w:tcMar>
-          </w:tcPr>
-          <w:p>
-            <w:pPr>
-              <w:jc w:val="center"/>
-            </w:pPr>
-            <w:r>
-              <w:rPr>
-                <w:rFonts w:ascii="Times New Roman" w:hAnsi="Times New Roman"/>
-                <w:b/>
-                <w:color w:val="FFFFFF"/>
-                <w:sz w:val="22"/>
-              </w:rPr>
-              <w:t>PHÂN LUỒNG VÀO TRANG CHỦ THÍCH ỨNG (ADAPTIVE ROUTING)</w:t>
-              <w:br/>
-              <w:t>- Học viên: Kiểm tra studentGroup (support / average / excellent) -&gt; Tải Kho đề thi &amp; Workspace với Adaptive Sidebar tương ứng.</w:t>
-              <w:br/>
-              <w:t>- Admin: Mở trang Quản trị (Quản lý Đề thi, Giám sát Học viên, Cấu hình Rubric Động).</w:t>
-            </w:r>
-          </w:p>
-        </w:tc>
-      </w:tr>
-      <w:tr>
-        <w:tc>
-          <w:tcPr>
-            <w:tcW w:type="dxa" w:w="9792"/>
-            <w:shd w:fill="FFFFFF"/>
-            <w:tcMar>
-              <w:top w:w="70" w:type="dxa"/>
-              <w:bottom w:w="70" w:type="dxa"/>
-              <w:left w:w="100" w:type="dxa"/>
-              <w:right w:w="100" w:type="dxa"/>
-            </w:tcMar>
-          </w:tcPr>
-          <w:p>
-            <w:pPr>
-              <w:jc w:val="center"/>
-            </w:pPr>
-            <w:r>
-              <w:rPr>
-                <w:rFonts w:ascii="Times New Roman" w:hAnsi="Times New Roman"/>
-                <w:b w:val="0"/>
-                <w:color w:val="2874A6"/>
-                <w:sz w:val="26"/>
-              </w:rPr>
-              <w:t>|</w:t>
-            </w:r>
-          </w:p>
-        </w:tc>
-      </w:tr>
-      <w:tr>
-        <w:tc>
-          <w:tcPr>
-            <w:tcW w:type="dxa" w:w="9792"/>
-            <w:shd w:fill="21618C"/>
-            <w:tcMar>
-              <w:top w:w="70" w:type="dxa"/>
-              <w:bottom w:w="70" w:type="dxa"/>
-              <w:left w:w="100" w:type="dxa"/>
-              <w:right w:w="100" w:type="dxa"/>
-            </w:tcMar>
-          </w:tcPr>
-          <w:p>
-            <w:pPr>
-              <w:jc w:val="center"/>
-            </w:pPr>
-            <w:r>
-              <w:rPr>
-                <w:rFonts w:ascii="Times New Roman" w:hAnsi="Times New Roman"/>
-                <w:b/>
-                <w:color w:val="FFFFFF"/>
-                <w:sz w:val="22"/>
-              </w:rPr>
-              <w:t>HỌC VIÊN LÀM BÀI VÀ NỘP BÀI LUẬN (WORKSPACE)</w:t>
-              <w:br/>
-              <w:t>Học viên viết bài luận -&gt; Bấm 'Nộp Bài Chấm AI' -&gt; Client gửi Payload về Backend.</w:t>
-            </w:r>
-          </w:p>
-        </w:tc>
-      </w:tr>
-      <w:tr>
-        <w:tc>
-          <w:tcPr>
-            <w:tcW w:type="dxa" w:w="9792"/>
-            <w:shd w:fill="FFFFFF"/>
-            <w:tcMar>
-              <w:top w:w="70" w:type="dxa"/>
-              <w:bottom w:w="70" w:type="dxa"/>
-              <w:left w:w="100" w:type="dxa"/>
-              <w:right w:w="100" w:type="dxa"/>
-            </w:tcMar>
-          </w:tcPr>
-          <w:p>
-            <w:pPr>
-              <w:jc w:val="center"/>
-            </w:pPr>
-            <w:r>
-              <w:rPr>
-                <w:rFonts w:ascii="Times New Roman" w:hAnsi="Times New Roman"/>
-                <w:b w:val="0"/>
-                <w:color w:val="2874A6"/>
-                <w:sz w:val="26"/>
-              </w:rPr>
-              <w:t>|</w:t>
-            </w:r>
-          </w:p>
-        </w:tc>
-      </w:tr>
-      <w:tr>
-        <w:tc>
-          <w:tcPr>
-            <w:tcW w:type="dxa" w:w="9792"/>
-            <w:shd w:fill="4A235A"/>
-            <w:tcMar>
-              <w:top w:w="70" w:type="dxa"/>
-              <w:bottom w:w="70" w:type="dxa"/>
-              <w:left w:w="100" w:type="dxa"/>
-              <w:right w:w="100" w:type="dxa"/>
-            </w:tcMar>
-          </w:tcPr>
-          <w:p>
-            <w:pPr>
-              <w:jc w:val="center"/>
-            </w:pPr>
-            <w:r>
-              <w:rPr>
-                <w:rFonts w:ascii="Times New Roman" w:hAnsi="Times New Roman"/>
-                <w:b/>
-                <w:color w:val="FFFFFF"/>
-                <w:sz w:val="22"/>
-              </w:rPr>
-              <w:t>BACKEND GỌI AI GPT-4O CHẤM BÀI THEO RUBRIC ĐỘNG (JSON MODE)</w:t>
-              <w:br/>
-              <w:t>- Đọc Rubric mới nhất từ CSDL MongoDB.</w:t>
-              <w:br/>
-              <w:t>- Gửi request tới GPT-4o -&gt; Trả kết quả Band Overall + 4 tiêu chí (TR, CC, LR, GRA) + Chi tiết bóc tách câu sai.</w:t>
-              <w:br/>
-              <w:t>- (Nếu API gián đoạn -&gt; Tự động kích hoạt Internal Fallback Engine).</w:t>
-            </w:r>
-          </w:p>
-        </w:tc>
-      </w:tr>
-      <w:tr>
-        <w:tc>
-          <w:tcPr>
-            <w:tcW w:type="dxa" w:w="9792"/>
-            <w:shd w:fill="FFFFFF"/>
-            <w:tcMar>
-              <w:top w:w="70" w:type="dxa"/>
-              <w:bottom w:w="70" w:type="dxa"/>
-              <w:left w:w="100" w:type="dxa"/>
-              <w:right w:w="100" w:type="dxa"/>
-            </w:tcMar>
-          </w:tcPr>
-          <w:p>
-            <w:pPr>
-              <w:jc w:val="center"/>
-            </w:pPr>
-            <w:r>
-              <w:rPr>
-                <w:rFonts w:ascii="Times New Roman" w:hAnsi="Times New Roman"/>
-                <w:b w:val="0"/>
-                <w:color w:val="2874A6"/>
-                <w:sz w:val="26"/>
-              </w:rPr>
-              <w:t>|</w:t>
-            </w:r>
-          </w:p>
-        </w:tc>
-      </w:tr>
-      <w:tr>
-        <w:tc>
-          <w:tcPr>
-            <w:tcW w:type="dxa" w:w="9792"/>
-            <w:shd w:fill="117A65"/>
-            <w:tcMar>
-              <w:top w:w="70" w:type="dxa"/>
-              <w:bottom w:w="70" w:type="dxa"/>
-              <w:left w:w="100" w:type="dxa"/>
-              <w:right w:w="100" w:type="dxa"/>
-            </w:tcMar>
-          </w:tcPr>
-          <w:p>
-            <w:pPr>
-              <w:jc w:val="center"/>
-            </w:pPr>
-            <w:r>
-              <w:rPr>
-                <w:rFonts w:ascii="Times New Roman" w:hAnsi="Times New Roman"/>
-                <w:b/>
-                <w:color w:val="FFFFFF"/>
-                <w:sz w:val="22"/>
-              </w:rPr>
-              <w:t>KẾT QUẢ VÀ BẢN ĐỒ SỬA LỖI TRỰC QUAN (INTERACTIVE RESULT)</w:t>
-              <w:br/>
-              <w:t>- Render Band điểm &amp; Thẻ bóc tách câu sai bôi đỏ (Corrections Canvas + Tooltip Popover).</w:t>
-              <w:br/>
-              <w:t>- Cập nhật Biểu đồ Tiến độ Recharts di động 4 tiêu chí.</w:t>
-            </w:r>
-          </w:p>
-        </w:tc>
-      </w:tr>
-      <w:tr>
-        <w:tc>
-          <w:tcPr>
-            <w:tcW w:type="dxa" w:w="9792"/>
-            <w:shd w:fill="FFFFFF"/>
-            <w:tcMar>
-              <w:top w:w="70" w:type="dxa"/>
-              <w:bottom w:w="70" w:type="dxa"/>
-              <w:left w:w="100" w:type="dxa"/>
-              <w:right w:w="100" w:type="dxa"/>
-            </w:tcMar>
-          </w:tcPr>
-          <w:p>
-            <w:pPr>
-              <w:jc w:val="center"/>
-            </w:pPr>
-            <w:r>
-              <w:rPr>
-                <w:rFonts w:ascii="Times New Roman" w:hAnsi="Times New Roman"/>
-                <w:b w:val="0"/>
-                <w:color w:val="2874A6"/>
-                <w:sz w:val="26"/>
-              </w:rPr>
-              <w:t>|</w:t>
-            </w:r>
-          </w:p>
-        </w:tc>
-      </w:tr>
-      <w:tr>
-        <w:tc>
-          <w:tcPr>
-            <w:tcW w:type="dxa" w:w="9792"/>
-            <w:shd w:fill="D35400"/>
-            <w:tcMar>
-              <w:top w:w="70" w:type="dxa"/>
-              <w:bottom w:w="70" w:type="dxa"/>
-              <w:left w:w="100" w:type="dxa"/>
-              <w:right w:w="100" w:type="dxa"/>
-            </w:tcMar>
-          </w:tcPr>
-          <w:p>
-            <w:pPr>
-              <w:jc w:val="center"/>
-            </w:pPr>
-            <w:r>
-              <w:rPr>
-                <w:rFonts w:ascii="Times New Roman" w:hAnsi="Times New Roman"/>
-                <w:b/>
-                <w:color w:val="FFFFFF"/>
-                <w:sz w:val="22"/>
-              </w:rPr>
-              <w:t>ĐÁNH GIÁ THĂNG HẠNG (LEVEL MIGRATION ENGINE)</w:t>
-              <w:br/>
-              <w:t>- Kiểm tra số bài hoàn thành &amp; Điểm di động (Moving Average).</w:t>
-              <w:br/>
-              <w:t>- Nếu đạt chuẩn -&gt; Phát thông báo mở khóa 'Bài Thi Chuyển Cấp' -&gt; Thi đỗ -&gt; Cập nhật studentGroup mới.</w:t>
-            </w:r>
-          </w:p>
-        </w:tc>
-      </w:tr>
-      <w:tr>
-        <w:tc>
-          <w:tcPr>
-            <w:tcW w:type="dxa" w:w="9792"/>
-            <w:shd w:fill="FFFFFF"/>
-            <w:tcMar>
-              <w:top w:w="70" w:type="dxa"/>
-              <w:bottom w:w="70" w:type="dxa"/>
-              <w:left w:w="100" w:type="dxa"/>
-              <w:right w:w="100" w:type="dxa"/>
-            </w:tcMar>
-          </w:tcPr>
-          <w:p>
-            <w:pPr>
-              <w:jc w:val="center"/>
-            </w:pPr>
-            <w:r>
-              <w:rPr>
-                <w:rFonts w:ascii="Times New Roman" w:hAnsi="Times New Roman"/>
-                <w:b w:val="0"/>
-                <w:color w:val="2874A6"/>
-                <w:sz w:val="26"/>
-              </w:rPr>
-              <w:t>|</w:t>
-            </w:r>
-          </w:p>
-        </w:tc>
-      </w:tr>
-      <w:tr>
-        <w:tc>
-          <w:tcPr>
-            <w:tcW w:type="dxa" w:w="9792"/>
-            <w:shd w:fill="17202A"/>
-            <w:tcMar>
-              <w:top w:w="70" w:type="dxa"/>
-              <w:bottom w:w="70" w:type="dxa"/>
-              <w:left w:w="100" w:type="dxa"/>
-              <w:right w:w="100" w:type="dxa"/>
-            </w:tcMar>
-          </w:tcPr>
-          <w:p>
-            <w:pPr>
-              <w:jc w:val="center"/>
-            </w:pPr>
-            <w:r>
-              <w:rPr>
-                <w:rFonts w:ascii="Times New Roman" w:hAnsi="Times New Roman"/>
-                <w:b/>
-                <w:color w:val="FFFFFF"/>
-                <w:sz w:val="22"/>
-              </w:rPr>
-              <w:t>[END] Hoàn thành chu trình học tập thích ứng &amp; Lưu lịch sử bền vững vào MongoDB Atlas</w:t>
-            </w:r>
-          </w:p>
-        </w:tc>
-      </w:tr>
-    </w:tbl>
+      </w:pPr>
+      <w:r>
+        <w:drawing>
+          <wp:inline xmlns:a="http://schemas.openxmlformats.org/drawingml/2006/main" xmlns:pic="http://schemas.openxmlformats.org/drawingml/2006/picture">
+            <wp:extent cx="6035040" cy="2193772"/>
+            <wp:docPr id="1" name="Picture 1"/>
+            <wp:cNvGraphicFramePr>
+              <a:graphicFrameLocks noChangeAspect="1"/>
+            </wp:cNvGraphicFramePr>
+            <a:graphic>
+              <a:graphicData uri="http://schemas.openxmlformats.org/drawingml/2006/picture">
+                <pic:pic>
+                  <pic:nvPicPr>
+                    <pic:cNvPr id="0" name="system_architecture.png"/>
+                    <pic:cNvPicPr/>
+                  </pic:nvPicPr>
+                  <pic:blipFill>
+                    <a:blip r:embed="rId9"/>
+                    <a:stretch>
+                      <a:fillRect/>
+                    </a:stretch>
+                  </pic:blipFill>
+                  <pic:spPr>
+                    <a:xfrm>
+                      <a:off x="0" y="0"/>
+                      <a:ext cx="6035040" cy="2193772"/>
+                    </a:xfrm>
+                    <a:prstGeom prst="rect"/>
+                  </pic:spPr>
+                </pic:pic>
+              </a:graphicData>
+            </a:graphic>
+          </wp:inline>
+        </w:drawing>
+      </w:r>
+    </w:p>
+    <w:p>
+      <w:pPr>
+        <w:spacing w:after="240"/>
+        <w:jc w:val="center"/>
+      </w:pPr>
+      <w:r>
+        <w:rPr>
+          <w:rFonts w:ascii="Times New Roman" w:hAnsi="Times New Roman"/>
+          <w:i/>
+          <w:color w:val="78909C"/>
+          <w:sz w:val="22"/>
+        </w:rPr>
+        <w:t>Hình 1: Sơ đồ Kiến trúc Hệ thống PlantUML (System Architecture Diagram)</w:t>
+      </w:r>
+    </w:p>
     <w:p/>
     <w:p>
       <w:pPr>

</xml_diff>

<commit_message>
Docs: simplify PlantUML System Architecture diagram and provide exhaustive, 100% matched detailed technical explanations in TAI_LIEU_KIEN_TRUC_HE_THONG_LMS.docx
</commit_message>
<xml_diff>
--- a/TAI_LIEU_KIEN_TRUC_HE_THONG_LMS.docx
+++ b/TAI_LIEU_KIEN_TRUC_HE_THONG_LMS.docx
@@ -44,7 +44,7 @@
                 <w:color w:val="FFFFFF"/>
                 <w:sz w:val="30"/>
               </w:rPr>
-              <w:t>TÀI LIỆU TÓM TẮT KIẾN TRÚC HỆ THỐNG &amp; SƠ ĐỒ HOẠT ĐỘNG (PLANTUML DIAGRAM)</w:t>
+              <w:t>TÀI LIỆU KIẾN TRÚC HỆ THỐNG &amp; DIỄN GIẢI LUỒNG HOẠT ĐỘNG CHUYÊN SÂU</w:t>
               <w:br/>
               <w:t>ENGLISH ADAPTIVE LMS (TRACK A)</w:t>
             </w:r>
@@ -65,7 +65,7 @@
           <w:color w:val="1B4F72"/>
           <w:sz w:val="30"/>
         </w:rPr>
-        <w:t>1. SƠ ĐỒ HOẠT ĐỘNG TỔNG QUAN HỆ THỐNG (SYSTEM ACTIVITY DIAGRAM)</w:t>
+        <w:t>1. SƠ ĐỒ KIẾN TRÚC HỆ THỐNG TỔNG QUAN (PLANTUML DIAGRAM)</w:t>
       </w:r>
     </w:p>
     <w:p>
@@ -76,7 +76,7 @@
         <w:rPr>
           <w:rFonts w:ascii="Times New Roman" w:hAnsi="Times New Roman"/>
         </w:rPr>
-        <w:t>Sơ đồ Activity dưới đây thể hiện luồng hoạt động tổng quan từ khi Người dùng truy cập hệ thống cho đến khi hoàn thành chấm bài AI và thăng hạng nhóm năng lực:</w:t>
+        <w:t>Sơ đồ trực quan dưới đây tổng hợp gọn gàng 4 khối kiến trúc chính cấu thành nên hệ thống English Adaptive LMS:</w:t>
       </w:r>
     </w:p>
     <w:p>
@@ -87,7 +87,7 @@
       <w:r>
         <w:drawing>
           <wp:inline xmlns:a="http://schemas.openxmlformats.org/drawingml/2006/main" xmlns:pic="http://schemas.openxmlformats.org/drawingml/2006/picture">
-            <wp:extent cx="6035040" cy="2193772"/>
+            <wp:extent cx="5029200" cy="3946525"/>
             <wp:docPr id="1" name="Picture 1"/>
             <wp:cNvGraphicFramePr>
               <a:graphicFrameLocks noChangeAspect="1"/>
@@ -108,7 +108,7 @@
                   <pic:spPr>
                     <a:xfrm>
                       <a:off x="0" y="0"/>
-                      <a:ext cx="6035040" cy="2193772"/>
+                      <a:ext cx="5029200" cy="3946525"/>
                     </a:xfrm>
                     <a:prstGeom prst="rect"/>
                   </pic:spPr>
@@ -131,7 +131,7 @@
           <w:color w:val="78909C"/>
           <w:sz w:val="22"/>
         </w:rPr>
-        <w:t>Hình 1: Sơ đồ Kiến trúc Hệ thống PlantUML (System Architecture Diagram)</w:t>
+        <w:t>Hình 1: Sơ đồ Tổng quan Khối Kiến trúc Hệ thống English Adaptive LMS</w:t>
       </w:r>
     </w:p>
     <w:p/>
@@ -147,7 +147,7 @@
           <w:color w:val="1B4F72"/>
           <w:sz w:val="30"/>
         </w:rPr>
-        <w:t>2. MÔ TẢ CHI TIẾT KIẾN TRÚC VÀ CÁC TẦNG HỆ THỐNG</w:t>
+        <w:t>2. DIỄN GIẢI CHI TIẾT KHỐI KIẾN TRÚC VÀ CÁC THÀNH PHẦN KHỚP 100% SƠ ĐỒ</w:t>
       </w:r>
     </w:p>
     <w:p>
@@ -162,7 +162,7 @@
           <w:color w:val="2874A6"/>
           <w:sz w:val="26"/>
         </w:rPr>
-        <w:t>2.1 Mô hình Kiến trúc 3 Tầng (Three-Tier Architecture)</w:t>
+        <w:t>2.1 Tầng Giao Diện Học Viên &amp; Quản Trị (Frontend Layer - ReactJS 18 + Vite)</w:t>
       </w:r>
     </w:p>
     <w:p>
@@ -174,41 +174,67 @@
           <w:rFonts w:ascii="Times New Roman" w:hAnsi="Times New Roman"/>
           <w:b/>
         </w:rPr>
-        <w:t xml:space="preserve">- Presentation Layer (Frontend): </w:t>
+        <w:t xml:space="preserve">- Học viên Workspace (Workspace.jsx): </w:t>
       </w:r>
       <w:r>
         <w:rPr>
           <w:rFonts w:ascii="Times New Roman" w:hAnsi="Times New Roman"/>
         </w:rPr>
-        <w:t>Xây dựng bằng ReactJS 18, Vite Engine, Tailwind CSS, Recharts, Lucide Icons. Phân luồng giao diện SPA thích ứng theo nhóm năng lực (support, average, excellent).</w:t>
-        <w:br/>
+        <w:t>Giao diện làm bài chuyên biệt tích hợp Bộ đếm thời gian (Timer), khung nhập bài luận (Editor), Dàn ý 4 phần Scaffolding (gợi ý Mở bài, Thân bài 1, Thân bài 2, Kết bài) và Nút kích hoạt 'Nộp Bài Chấm AI'.</w:t>
       </w:r>
+    </w:p>
+    <w:p>
+      <w:pPr>
+        <w:jc w:val="left"/>
+      </w:pPr>
       <w:r>
         <w:rPr>
           <w:rFonts w:ascii="Times New Roman" w:hAnsi="Times New Roman"/>
           <w:b/>
         </w:rPr>
-        <w:t xml:space="preserve">- Application Layer (Backend API): </w:t>
+        <w:t xml:space="preserve">- Bản đồ Sửa lỗi Trực quan (Corrections Canvas): </w:t>
       </w:r>
       <w:r>
         <w:rPr>
           <w:rFonts w:ascii="Times New Roman" w:hAnsi="Times New Roman"/>
         </w:rPr>
-        <w:t>Node.js, ExpressJS framework. Xử lý logic phân nhóm năng lực, Thuật toán di chuyển cấp độ (Level Migration Engine), Tích hợp GPT-4o JSON Mode chấm bài &amp; fallback engine.</w:t>
-        <w:br/>
+        <w:t>Render bảng điểm Band Overall, 4 thẻ điểm thành phần (TR, CC, LR, GRA) kèm vùng bôi đỏ chi tiết các câu viết sai grammar/vocabulary cùng tooltip popover gợi ý sửa.</w:t>
       </w:r>
+    </w:p>
+    <w:p>
+      <w:pPr>
+        <w:jc w:val="left"/>
+      </w:pPr>
       <w:r>
         <w:rPr>
           <w:rFonts w:ascii="Times New Roman" w:hAnsi="Times New Roman"/>
           <w:b/>
         </w:rPr>
-        <w:t xml:space="preserve">- Data Layer (Database): </w:t>
+        <w:t xml:space="preserve">- Trang Dashboard Thích Ứng (StudentDashboard.jsx): </w:t>
       </w:r>
       <w:r>
         <w:rPr>
           <w:rFonts w:ascii="Times New Roman" w:hAnsi="Times New Roman"/>
         </w:rPr>
-        <w:t>MongoDB Atlas Cloud Cluster, Mongoose ODM Schema.</w:t>
+        <w:t>Tự động phân luồng đề thi theo đúng nhóm năng lực hiện tại (support, average, excellent) và hiển thị nút kích hoạt sinh đề độc bản AI Master Exam Generator.</w:t>
+      </w:r>
+    </w:p>
+    <w:p>
+      <w:pPr>
+        <w:jc w:val="left"/>
+      </w:pPr>
+      <w:r>
+        <w:rPr>
+          <w:rFonts w:ascii="Times New Roman" w:hAnsi="Times New Roman"/>
+          <w:b/>
+        </w:rPr>
+        <w:t xml:space="preserve">- Admin Dashboard &amp; Rubric Manager: </w:t>
+      </w:r>
+      <w:r>
+        <w:rPr>
+          <w:rFonts w:ascii="Times New Roman" w:hAnsi="Times New Roman"/>
+        </w:rPr>
+        <w:t>Trang quản trị cho phép Giáo viên tạo/sửa đề thi, tải tài liệu PDF/Word lên hệ thống, theo dõi danh sách học viên nộp bài và tùy chỉnh ma trận Rubric 4 tiêu chí chấm điểm động.</w:t>
       </w:r>
     </w:p>
     <w:p>
@@ -223,7 +249,7 @@
           <w:color w:val="2874A6"/>
           <w:sz w:val="26"/>
         </w:rPr>
-        <w:t>2.2 Chi tiết 7 Mongoose Schemas CSDL</w:t>
+        <w:t>2.2 Tầng Máy Chủ API &amp; Bảo Mật (Backend Server - Node.js + ExpressJS)</w:t>
       </w:r>
     </w:p>
     <w:p>
@@ -235,15 +261,13 @@
           <w:rFonts w:ascii="Times New Roman" w:hAnsi="Times New Roman"/>
           <w:b/>
         </w:rPr>
-        <w:t xml:space="preserve">- User Model: </w:t>
+        <w:t xml:space="preserve">- API Gateway &amp; Xác thực JWT Token (auth.js &amp; middleware): </w:t>
       </w:r>
       <w:r>
         <w:rPr>
           <w:rFonts w:ascii="Times New Roman" w:hAnsi="Times New Roman"/>
         </w:rPr>
-        <w:t>Lưu thông tin người dùng, phân cấp nhóm năng lực.</w:t>
-        <w:br/>
-        <w:t xml:space="preserve">  Các thuộc tính: name, email (unique index), password (hashed), role ('student' | 'admin'), studentGroup ('support' | 'average' | 'excellent'), targetBand.</w:t>
+        <w:t>Tiếp nhận mọi request REST APIs từ Client. Kiểm tra Header Authorization JWT Token, mã hóa mật khẩu bcryptJS và phân quyền bảo mật theo nhóm người dùng ('student' hoặc 'admin').</w:t>
       </w:r>
     </w:p>
     <w:p>
@@ -255,15 +279,13 @@
           <w:rFonts w:ascii="Times New Roman" w:hAnsi="Times New Roman"/>
           <w:b/>
         </w:rPr>
-        <w:t xml:space="preserve">- Assignment Model: </w:t>
+        <w:t xml:space="preserve">- Adaptive Router &amp; Level Migration Engine (grading.js &amp; User Model): </w:t>
       </w:r>
       <w:r>
         <w:rPr>
           <w:rFonts w:ascii="Times New Roman" w:hAnsi="Times New Roman"/>
         </w:rPr>
-        <w:t>Quản lý kho đề thi &amp; Học liệu thích ứng.</w:t>
-        <w:br/>
-        <w:t xml:space="preserve">  Các thuộc tính: title, prompt, topic, targetGroup, scaffoldingTemplate (Dàn ý 4 phần), groupSampleAnswers (3 bài mẫu 3 Band), suggestedVocabulary.</w:t>
+        <w:t>Đảm nhiệm tính năng cá nhân hóa trải nghiệm học tập. Tính toán điểm số trung bình di động (Moving Average) của 3 bài gần nhất. Khi học viên làm hết đề đạt chuẩn, tự động mở khóa 'Bài Thi Chuyển Cấp' và cập nhật trường studentGroup trong CSDL.</w:t>
       </w:r>
     </w:p>
     <w:p>
@@ -275,15 +297,13 @@
           <w:rFonts w:ascii="Times New Roman" w:hAnsi="Times New Roman"/>
           <w:b/>
         </w:rPr>
-        <w:t xml:space="preserve">- Submission Model: </w:t>
+        <w:t xml:space="preserve">- AI Grading Engine &amp; Rubric Engine: </w:t>
       </w:r>
       <w:r>
         <w:rPr>
           <w:rFonts w:ascii="Times New Roman" w:hAnsi="Times New Roman"/>
         </w:rPr>
-        <w:t>Lưu lịch sử bài nộp &amp; Bóc tách kết quả chấm AI.</w:t>
-        <w:br/>
-        <w:t xml:space="preserve">  Các thuộc tính: studentId (Ref User), assignmentId (Ref Assignment), studentAnswers, overallBand, criteriaScores (TR, CC, LR, GRA), detailedCorrections, advancedVocabularyEnhancements.</w:t>
+        <w:t>Truy vấn CSDL MongoDB để lấy bộ tiêu chí Rubric chuẩn mới nhất, ghép bài làm của học viên vào System Prompt nâng cao để chuẩn bị gửi sang dịch vụ AI.</w:t>
       </w:r>
     </w:p>
     <w:p>
@@ -295,15 +315,28 @@
           <w:rFonts w:ascii="Times New Roman" w:hAnsi="Times New Roman"/>
           <w:b/>
         </w:rPr>
-        <w:t xml:space="preserve">- Rubric Model: </w:t>
+        <w:t xml:space="preserve">- Internal Fallback Grading Engine: </w:t>
       </w:r>
       <w:r>
         <w:rPr>
           <w:rFonts w:ascii="Times New Roman" w:hAnsi="Times New Roman"/>
         </w:rPr>
-        <w:t>Quản lý quy tắc chấm điểm động cho Admin.</w:t>
-        <w:br/>
-        <w:t xml:space="preserve">  Các thuộc tính: criterionKey ('TR' | 'CC' | 'LR' | 'GRA'), name, description, bands (5, 6, 7, 8), coachNotes ('5-6', '6-7', '7-8').</w:t>
+        <w:t>Hệ thống phân tích tự động nội bộ. Trường hợp kết nối OpenAI API bị nghẽn mạng hoặc quá tải, Fallback Engine lập tức tự động kích hoạt, phân tích mật độ từ vựng C1/C2, ngữ pháp và độ dài để chấm bài độc lập, đảm bảo bài nộp của học viên luôn được xử lý suôn sẻ 100%.</w:t>
+      </w:r>
+    </w:p>
+    <w:p>
+      <w:pPr>
+        <w:pStyle w:val="Heading2"/>
+        <w:spacing w:before="200" w:after="60"/>
+      </w:pPr>
+      <w:r>
+        <w:rPr>
+          <w:rFonts w:ascii="Times New Roman" w:hAnsi="Times New Roman"/>
+          <w:b/>
+          <w:color w:val="2874A6"/>
+          <w:sz w:val="26"/>
+        </w:rPr>
+        <w:t>2.3 Dịch Vụ AI Bên Ngoài (External AI Services)</w:t>
       </w:r>
     </w:p>
     <w:p>
@@ -315,15 +348,118 @@
           <w:rFonts w:ascii="Times New Roman" w:hAnsi="Times New Roman"/>
           <w:b/>
         </w:rPr>
-        <w:t xml:space="preserve">- Notification Model: </w:t>
+        <w:t xml:space="preserve">- Mô hình OpenAI GPT-4o: </w:t>
       </w:r>
       <w:r>
         <w:rPr>
           <w:rFonts w:ascii="Times New Roman" w:hAnsi="Times New Roman"/>
         </w:rPr>
-        <w:t>Lịch sử thông báo &amp; Kho tài liệu học tập.</w:t>
-        <w:br/>
-        <w:t xml:space="preserve">  Các thuộc tính: recipientId, senderId, type ('submission_alert' | 'document_share' | 'promotion_unlocked'), title, message, documentUrl, documentName, targetGroup, isRead.</w:t>
+        <w:t>Được tích hợp qua OpenAI Node.js SDK chính thức. Nhận prompt kèm ngữ cảnh IELTS Task 2 và cấu trúc Rubric, trả về kết quả dưới dạng JSON Mode chuẩn hóa (gồm Band overall, Band thành phần, danh sách đoạn văn bóc tách lỗi sai chi tiết).</w:t>
+      </w:r>
+    </w:p>
+    <w:p>
+      <w:pPr>
+        <w:pStyle w:val="Heading2"/>
+        <w:spacing w:before="200" w:after="60"/>
+      </w:pPr>
+      <w:r>
+        <w:rPr>
+          <w:rFonts w:ascii="Times New Roman" w:hAnsi="Times New Roman"/>
+          <w:b/>
+          <w:color w:val="2874A6"/>
+          <w:sz w:val="26"/>
+        </w:rPr>
+        <w:t>2.4 Tầng Cơ Sở Dữ Liệu Đám Mây (Cloud Database - MongoDB Atlas Cluster)</w:t>
+      </w:r>
+    </w:p>
+    <w:p>
+      <w:pPr>
+        <w:jc w:val="left"/>
+      </w:pPr>
+      <w:r>
+        <w:rPr>
+          <w:rFonts w:ascii="Times New Roman" w:hAnsi="Times New Roman"/>
+          <w:b/>
+        </w:rPr>
+        <w:t xml:space="preserve">- Users Collection: </w:t>
+      </w:r>
+      <w:r>
+        <w:rPr>
+          <w:rFonts w:ascii="Times New Roman" w:hAnsi="Times New Roman"/>
+        </w:rPr>
+        <w:t>Lưu trữ tài khoản, mật khẩu mã hóa, vai trò (role) và nhóm năng lực phân loại hiện tại (studentGroup).</w:t>
+      </w:r>
+    </w:p>
+    <w:p>
+      <w:pPr>
+        <w:jc w:val="left"/>
+      </w:pPr>
+      <w:r>
+        <w:rPr>
+          <w:rFonts w:ascii="Times New Roman" w:hAnsi="Times New Roman"/>
+          <w:b/>
+        </w:rPr>
+        <w:t xml:space="preserve">- Assignments Collection: </w:t>
+      </w:r>
+      <w:r>
+        <w:rPr>
+          <w:rFonts w:ascii="Times New Roman" w:hAnsi="Times New Roman"/>
+        </w:rPr>
+        <w:t>Lưu trữ kho đề thi thích ứng, dàn ý 4 phần scaffolding, bộ từ vựng gợi ý C1/C2 và 3 bài làm mẫu tương ứng 3 nhóm.</w:t>
+      </w:r>
+    </w:p>
+    <w:p>
+      <w:pPr>
+        <w:jc w:val="left"/>
+      </w:pPr>
+      <w:r>
+        <w:rPr>
+          <w:rFonts w:ascii="Times New Roman" w:hAnsi="Times New Roman"/>
+          <w:b/>
+        </w:rPr>
+        <w:t xml:space="preserve">- Submissions Collection: </w:t>
+      </w:r>
+      <w:r>
+        <w:rPr>
+          <w:rFonts w:ascii="Times New Roman" w:hAnsi="Times New Roman"/>
+        </w:rPr>
+        <w:t>Lưu chi tiết từng bài nộp của học viên, mảng bóc tách lỗi chi tiết, điểm số 4 tiêu chí và tiến độ lịch sử.</w:t>
+      </w:r>
+    </w:p>
+    <w:p>
+      <w:pPr>
+        <w:jc w:val="left"/>
+      </w:pPr>
+      <w:r>
+        <w:rPr>
+          <w:rFonts w:ascii="Times New Roman" w:hAnsi="Times New Roman"/>
+          <w:b/>
+        </w:rPr>
+        <w:t xml:space="preserve">- Rubrics Collection: </w:t>
+      </w:r>
+      <w:r>
+        <w:rPr>
+          <w:rFonts w:ascii="Times New Roman" w:hAnsi="Times New Roman"/>
+        </w:rPr>
+        <w:t>Lưu ma trận tiêu chí chấm điểm IELTS Task 2 động (TR, CC, LR, GRA) có thể điều chỉnh linh hoạt.</w:t>
+      </w:r>
+    </w:p>
+    <w:p>
+      <w:pPr>
+        <w:jc w:val="left"/>
+      </w:pPr>
+      <w:r>
+        <w:rPr>
+          <w:rFonts w:ascii="Times New Roman" w:hAnsi="Times New Roman"/>
+          <w:b/>
+        </w:rPr>
+        <w:t xml:space="preserve">- Notifications Collection: </w:t>
+      </w:r>
+      <w:r>
+        <w:rPr>
+          <w:rFonts w:ascii="Times New Roman" w:hAnsi="Times New Roman"/>
+        </w:rPr>
+        <w:t>Lưu lịch sử thông báo thăng hạng, thông báo hệ thống và cảnh báo tự động gửi cho Admin khi có học viên đăng ký/nộp bài mới.</w:t>
       </w:r>
     </w:p>
     <w:p/>
@@ -339,22 +475,7 @@
           <w:color w:val="1B4F72"/>
           <w:sz w:val="30"/>
         </w:rPr>
-        <w:t>3. CHI TIẾT CÁC LUỒNG XỬ LÝ NGHIỆP VỤ (BUSINESS LOGIC DETAILS)</w:t>
-      </w:r>
-    </w:p>
-    <w:p>
-      <w:pPr>
-        <w:pStyle w:val="Heading2"/>
-        <w:spacing w:before="200" w:after="60"/>
-      </w:pPr>
-      <w:r>
-        <w:rPr>
-          <w:rFonts w:ascii="Times New Roman" w:hAnsi="Times New Roman"/>
-          <w:b/>
-          <w:color w:val="2874A6"/>
-          <w:sz w:val="26"/>
-        </w:rPr>
-        <w:t>3.1 Quy trình Chấm Bài AI GPT-4o &amp; Fallback Grading</w:t>
+        <w:t>3. QUY TRÌNH HOẠT ĐỘNG HOÀN CHỈNH TỪ KHI HỌC VIÊN NỘP BÀI TỚI KHI THĂNG HẠNG</w:t>
       </w:r>
     </w:p>
     <w:p>
@@ -364,31 +485,16 @@
       <w:r>
         <w:rPr>
           <w:rFonts w:ascii="Times New Roman" w:hAnsi="Times New Roman"/>
+          <w:b/>
+          <w:color w:val="1F4E78"/>
         </w:rPr>
-        <w:t>1. Client gửi POST /api/grading/submit chứa assignmentId và studentAnswers.</w:t>
-        <w:br/>
-        <w:t>2. Backend đọc cấu hình Rubric mới nhất từ MongoDB rubrics collection để nhúng vào System Prompt.</w:t>
-        <w:br/>
-        <w:t>3. Gọi OpenAI API (gpt-4o) với response_format: { type: 'json_object' }.</w:t>
-        <w:br/>
-        <w:t>4. Nếu API gián đoạn, tự động bật Fallback Grading Engine phân tích độ dài, từ vựng học thuật và cấu trúc câu.</w:t>
-        <w:br/>
-        <w:t>5. Lưu bản ghi vào MongoDB Submissions và tự động gửi Notification cho Admin.</w:t>
+        <w:t xml:space="preserve">• Bước 1: Học viên soạn bài luận &amp; Nộp bài: </w:t>
       </w:r>
-    </w:p>
-    <w:p>
-      <w:pPr>
-        <w:pStyle w:val="Heading2"/>
-        <w:spacing w:before="200" w:after="60"/>
-      </w:pPr>
       <w:r>
         <w:rPr>
           <w:rFonts w:ascii="Times New Roman" w:hAnsi="Times New Roman"/>
-          <w:b/>
-          <w:color w:val="2874A6"/>
-          <w:sz w:val="26"/>
         </w:rPr>
-        <w:t>3.2 Quy trình Thăng Hạng &amp; Bài Thi Chuyển Cấp (Level Migration)</w:t>
+        <w:t>Học viên vào Workspace làm bài luận dựa trên Dàn ý 4 phần Scaffolding. Bấm nút 'Nộp Bài Chấm AI'. Client gửi HTTP POST /api/grading/submit về Backend Server.</w:t>
       </w:r>
     </w:p>
     <w:p>
@@ -398,12 +504,73 @@
       <w:r>
         <w:rPr>
           <w:rFonts w:ascii="Times New Roman" w:hAnsi="Times New Roman"/>
+          <w:b/>
+          <w:color w:val="1F4E78"/>
         </w:rPr>
-        <w:t>1. Hệ thống tính điểm di động (Moving Average) dựa trên 3 bài nộp gần nhất.</w:t>
-        <w:br/>
-        <w:t>2. Khi hoàn thành đủ bài thi nhóm hiện tại đạt điểm sàn -&gt; Phát thông báo mở khóa Bài Thi Chuyển Cấp.</w:t>
-        <w:br/>
-        <w:t>3. Học viên nộp bài Chuyển Cấp -&gt; Nếu điểm &gt;= 6.0 (cho Support -&gt; Average) hoặc &gt;= 7.0 (cho Average -&gt; Excellent), hệ thống cập nhật studentGroup mới trong CSDL User.</w:t>
+        <w:t xml:space="preserve">• Bước 2: Xác thực &amp; Tải Rubric Động: </w:t>
+      </w:r>
+      <w:r>
+        <w:rPr>
+          <w:rFonts w:ascii="Times New Roman" w:hAnsi="Times New Roman"/>
+        </w:rPr>
+        <w:t>Backend kiểm tra JWT Token. Sau đó đọc ma trận Rubric 4 tiêu chí (TR, CC, LR, GRA) từ Rubrics Collection trong MongoDB Atlas để xây dựng System Prompt.</w:t>
+      </w:r>
+    </w:p>
+    <w:p>
+      <w:pPr>
+        <w:jc w:val="left"/>
+      </w:pPr>
+      <w:r>
+        <w:rPr>
+          <w:rFonts w:ascii="Times New Roman" w:hAnsi="Times New Roman"/>
+          <w:b/>
+          <w:color w:val="1F4E78"/>
+        </w:rPr>
+        <w:t xml:space="preserve">• Bước 3: Chấm bài bằng OpenAI GPT-4o &amp; Fallback: </w:t>
+      </w:r>
+      <w:r>
+        <w:rPr>
+          <w:rFonts w:ascii="Times New Roman" w:hAnsi="Times New Roman"/>
+        </w:rPr>
+        <w:t>Backend gửi request sang OpenAI API (gpt-4o) theo chuẩn JSON Mode. Nếu có sự cố mạng, Internal Fallback Engine tự động kích hoạt để chấm bài suôn sẻ.</w:t>
+      </w:r>
+    </w:p>
+    <w:p>
+      <w:pPr>
+        <w:jc w:val="left"/>
+      </w:pPr>
+      <w:r>
+        <w:rPr>
+          <w:rFonts w:ascii="Times New Roman" w:hAnsi="Times New Roman"/>
+          <w:b/>
+          <w:color w:val="1F4E78"/>
+        </w:rPr>
+        <w:t xml:space="preserve">• Bước 4: Lưu kết quả &amp; Render giao diện bóc tách lỗi: </w:t>
+      </w:r>
+      <w:r>
+        <w:rPr>
+          <w:rFonts w:ascii="Times New Roman" w:hAnsi="Times New Roman"/>
+        </w:rPr>
+        <w:t>Kết quả chấm bài được lưu vào Submissions Collection. Frontend nhận phản hồi và hiển thị Band điểm, mảng thẻ bôi đỏ bóc tách câu sai (Corrections Canvas) và Biểu đồ tiến độ Recharts.</w:t>
+      </w:r>
+    </w:p>
+    <w:p>
+      <w:pPr>
+        <w:jc w:val="left"/>
+      </w:pPr>
+      <w:r>
+        <w:rPr>
+          <w:rFonts w:ascii="Times New Roman" w:hAnsi="Times New Roman"/>
+          <w:b/>
+          <w:color w:val="1F4E78"/>
+        </w:rPr>
+        <w:t xml:space="preserve">• Bước 5: Đánh giá Thăng hạng &amp; Phát Thông báo: </w:t>
+      </w:r>
+      <w:r>
+        <w:rPr>
+          <w:rFonts w:ascii="Times New Roman" w:hAnsi="Times New Roman"/>
+        </w:rPr>
+        <w:t>Level Migration Engine tính lại điểm trung bình 3 bài gần nhất. Nếu đủ điều kiện, mở khóa 'Bài Thi Chuyển Cấp' -&gt; Học viên thi đỗ -&gt; Hệ thống tự động nâng studentGroup và phát Thông báo thành công.</w:t>
       </w:r>
     </w:p>
     <w:sectPr>

</xml_diff>

<commit_message>
Docs: update all Word documentation files to reflect single dynamic sample answer field per targetGroup and auto GPT-4o vocab/exercise extraction
</commit_message>
<xml_diff>
--- a/TAI_LIEU_KIEN_TRUC_HE_THONG_LMS.docx
+++ b/TAI_LIEU_KIEN_TRUC_HE_THONG_LMS.docx
@@ -234,7 +234,7 @@
         <w:rPr>
           <w:rFonts w:ascii="Times New Roman" w:hAnsi="Times New Roman"/>
         </w:rPr>
-        <w:t>Trang quản trị cho phép Giáo viên tạo/sửa đề thi, tải tài liệu PDF/Word lên hệ thống, theo dõi danh sách học viên nộp bài và tùy chỉnh ma trận Rubric 4 tiêu chí chấm điểm động.</w:t>
+        <w:t>Trang quản trị cho phép Giáo viên tạo/sửa đề thi thích ứng theo nhóm năng lực đích chọn trước (gồm bài mẫu chuẩn Band tương ứng, tự động trích xuất 10 từ vựng C1/C2 &amp; 10 bài tập điền từ bằng AI), tải tài liệu PDF/Word lên hệ thống, theo dõi danh sách học viên nộp bài và tùy chỉnh ma trận Rubric 4 tiêu chí chấm điểm động.</w:t>
       </w:r>
     </w:p>
     <w:p>
@@ -303,7 +303,7 @@
         <w:rPr>
           <w:rFonts w:ascii="Times New Roman" w:hAnsi="Times New Roman"/>
         </w:rPr>
-        <w:t>Truy vấn CSDL MongoDB để lấy bộ tiêu chí Rubric chuẩn mới nhất, ghép bài làm của học viên vào System Prompt nâng cao để chuẩn bị gửi sang dịch vụ AI.</w:t>
+        <w:t>Truy vấn CSDL MongoDB để lấy bộ tiêu chí Rubric chuẩn mới nhất, ghép bài làm của học viên vào System Prompt nâng cao để chuẩn bị gửi sang dịch vụ AI. Đồng thời tự động phân tích bài luận mẫu của Admin để trích xuất 10 từ vựng C1/C2 và 10 bài tập tương tác.</w:t>
       </w:r>
     </w:p>
     <w:p>
@@ -354,7 +354,7 @@
         <w:rPr>
           <w:rFonts w:ascii="Times New Roman" w:hAnsi="Times New Roman"/>
         </w:rPr>
-        <w:t>Được tích hợp qua OpenAI Node.js SDK chính thức. Nhận prompt kèm ngữ cảnh IELTS Task 2 và cấu trúc Rubric, trả về kết quả dưới dạng JSON Mode chuẩn hóa (gồm Band overall, Band thành phần, danh sách đoạn văn bóc tách lỗi sai chi tiết).</w:t>
+        <w:t>Được tích hợp qua OpenAI Node.js SDK chính thức. Đóng vai trò vừa chấm bài luận IELTS Task 2 theo JSON Mode chuẩn hóa, vừa tự động phân tích bài luận mẫu của Admin để bóc tách từ vựng C1/C2 và sinh 10 bài tập điền từ tương tác.</w:t>
       </w:r>
     </w:p>
     <w:p>
@@ -405,7 +405,7 @@
         <w:rPr>
           <w:rFonts w:ascii="Times New Roman" w:hAnsi="Times New Roman"/>
         </w:rPr>
-        <w:t>Lưu trữ kho đề thi thích ứng, dàn ý 4 phần scaffolding, bộ từ vựng gợi ý C1/C2 và 3 bài làm mẫu tương ứng 3 nhóm.</w:t>
+        <w:t>Lưu trữ kho đề thi thích ứng (phân loại theo targetGroup), dàn ý 4 phần scaffolding, bài làm mẫu chuẩn Band của nhóm đích, bộ từ vựng gợi ý C1/C2 và 10 bài tập điền từ tương tác.</w:t>
       </w:r>
     </w:p>
     <w:p>

</xml_diff>